<commit_message>
Throughput-optimised architecture: transfer channels, reduced passes, exact tool-path optimisation, pipelined servicing
- Bolt transfer scales with channels (c); new configurations A-E remove the four-head
  design's bottlenecks one at a time on the same Monte Carlo samples
- Exact Held-Karp tool-path optimisation under a load-spreading constraint (no closer
  than the legacy sequence's closest step): small gain, because the opposite-bolt rule
  fixes most of the travel
- Multi-head travel now uses the shortest move on the ring of N/r stations
- Bolting and complete-operation targets reported separately; pipelined servicing model
- Manuscript: new Section 5.5, Table 5, Fig. 6; later figures/tables renumbered;
  corrected the pass-removal saving (15 %, not 'a quarter')

Co-Authored-By: Claude Opus 5.5 <noreply@anthropic.com>
</commit_message>
<xml_diff>
--- a/manuscript/PABHS_IJAMT_Manuscript.docx
+++ b/manuscript/PABHS_IJAMT_Manuscript.docx
@@ -71,7 +71,7 @@
           <w:i w:val="0"/>
           <w:sz w:val="22"/>
         </w:rPr>
-        <w:t>Large bolted closures on process vessels are still assembled and disassembled largely by hand, often in hazardous areas, following multi-pass tightening sequences whose duration and preload outcome are rarely quantified. This paper evaluates, by simulation rather than by claim, an automated architecture for such closures: orbital pneumatic torque runners on the flange, a bolt-management carousel, a counterbalanced head manipulator and an interlocking sequence controller, applied to a 92-bolt, three-flange delayed-coking drum. A Monte Carlo cycle-time model built on the actual star-pattern rail travel shows that one torque head per flange needs a median 8.0 h to unbolt and re-bolt the drum, and cannot reach a 2.5 h target even with every step at its fastest assumed value; four synchronised heads per flange give 2.3 h, within the target in 70% of samples. With four heads the carousel, not the torque tool, becomes the rate-limiting element. A preload model shows that specifying ±2% torque accuracy has almost no effect on preload scatter, which nut-factor variation dominates, whereas a torque–angle check with re-torque cuts the fraction of bolts outside ±10% of target from 32% to 5%. Exhaustive verification of the interlock logic finds no safety violation, but shows that the interlocks as originally specified deadlock after an emergency stop mid-sequence; an explicit resume rule removes every deadlock. Pneumatic head handling is feasible only with a counterbalance carrying most of the load. The results are predictions from stated assumptions, and a validation programme with acceptance criteria is given.</w:t>
+        <w:t>Large bolted closures on process vessels are still assembled largely by hand, often in hazardous areas, using multi-pass tightening sequences whose duration and preload outcome are rarely quantified. This paper evaluates by simulation an automated architecture for such closures: orbital pneumatic torque runners on the flange, a bolt-management carousel, a counterbalanced head manipulator and an interlocking sequence controller, applied to a 92-bolt, three-flange delayed-coking drum. A Monte Carlo cycle-time model built on the actual star-pattern rail travel shows that one torque head per flange needs a median 8.0 h to unbolt and re-bolt the drum and cannot reach a 2.5 h target under any assumed step times. Removing bottlenecks in turn gives 2.3 h with four synchronised heads, 1.8 h with a bolt-transfer channel per head and 1.6 h with one fewer star pass; an exactly optimised tool path adds little, because the travel is fixed by the opposite-bolt rule. The complete operation, including head handling, gasket work and leak testing, remains 3.4 h. Specifying ±2% torque accuracy barely affects preload scatter, which nut-factor variation dominates; a torque–angle check with re-torque cuts the share of bolts outside ±10% of target from 32% to 5%. Exhaustive verification of the interlock logic finds no safety violation, but the interlocks as first specified deadlock after a mid-sequence emergency stop; a resume rule removes every deadlock. Pneumatic head handling needs a counterbalance carrying most of the load. All results are predictions; a validation programme with acceptance criteria is given.</w:t>
       </w:r>
     </w:p>
     <w:p>
@@ -147,7 +147,7 @@
           <w:i w:val="0"/>
           <w:sz w:val="22"/>
         </w:rPr>
-        <w:t>The contributions are: (i) a cycle-time model for automated multi-pass flange bolting that computes carriage travel from the actual tightening sequence and propagates step-time uncertainty by Monte Carlo simulation, with a rank-correlation sensitivity analysis; (ii) an admissibility analysis giving the per-bolt-pass time budget implied by a cycle-time target, and the number of synchronised torque heads needed to meet it; (iii) a preload analysis separating the contributions of tool accuracy, nut-factor scatter and torque–angle verification; (iv) exhaustive verification of the sequence and interlock logic, including mutation tests and a liveness check that exposes a deadlock in the logic as first specified; and (v) a force budget for pneumatic head handling, a scored design FMEA and a hazard-exposure comparison. All models are released as open code, and the paper ends with a validation plan whose acceptance criteria can falsify its predictions.</w:t>
+        <w:t>The contributions are: (i) a cycle-time model for automated multi-pass flange bolting that computes carriage travel from the actual tightening sequence and propagates step-time uncertainty by Monte Carlo simulation, with a rank-correlation sensitivity analysis; (ii) an admissibility analysis giving the per-bolt-pass time budget implied by a cycle-time target; (iii) a throughput-optimisation study that removes the architecture's bottlenecks one at a time — torque heads, bolt-transfer channels, tightening passes, an exactly optimised tool path under a load-spreading constraint, and pipelined servicing — and reports bolting and complete-operation times separately; (iv) a preload analysis separating the contributions of tool accuracy, nut-factor scatter and torque–angle verification; (v) exhaustive verification of the sequence and interlock logic, including mutation tests and a liveness check that exposes a deadlock in the logic as first specified; and (vi) a force budget for pneumatic head handling, a scored design FMEA and a hazard-exposure comparison. All models are released as open code, and the paper ends with a validation plan whose acceptance criteria can falsify its predictions.</w:t>
       </w:r>
     </w:p>
     <w:p>
@@ -741,6 +741,59 @@
                 <w:sz w:val="17"/>
               </w:rPr>
               <w:t>Source proposal</w:t>
+            </w:r>
+          </w:p>
+        </w:tc>
+      </w:tr>
+      <w:tr>
+        <w:tc>
+          <w:tcPr>
+            <w:tcW w:type="dxa" w:w="2448"/>
+          </w:tcPr>
+          <w:p>
+            <w:pPr>
+              <w:spacing w:line="240" w:lineRule="auto" w:after="0"/>
+            </w:pPr>
+            <w:r/>
+            <w:r>
+              <w:rPr>
+                <w:sz w:val="17"/>
+              </w:rPr>
+              <w:t>Complete operation (open + close, excluding decoking)</w:t>
+            </w:r>
+          </w:p>
+        </w:tc>
+        <w:tc>
+          <w:tcPr>
+            <w:tcW w:type="dxa" w:w="4464"/>
+          </w:tcPr>
+          <w:p>
+            <w:pPr>
+              <w:spacing w:line="240" w:lineRule="auto" w:after="0"/>
+            </w:pPr>
+            <w:r/>
+            <w:r>
+              <w:rPr>
+                <w:sz w:val="17"/>
+              </w:rPr>
+              <w:t>Not stated in the source; evaluated here against the same 2.5 h</w:t>
+            </w:r>
+          </w:p>
+        </w:tc>
+        <w:tc>
+          <w:tcPr>
+            <w:tcW w:type="dxa" w:w="2160"/>
+          </w:tcPr>
+          <w:p>
+            <w:pPr>
+              <w:spacing w:line="240" w:lineRule="auto" w:after="0"/>
+            </w:pPr>
+            <w:r/>
+            <w:r>
+              <w:rPr>
+                <w:sz w:val="17"/>
+              </w:rPr>
+              <w:t>This paper</w:t>
             </w:r>
           </w:p>
         </w:tc>
@@ -1226,7 +1279,7 @@
         <w:rPr>
           <w:i/>
         </w:rPr>
-        <w:t>L = (πD / N) Σₖ min(|jₖ₊₁ − jₖ| mod N, N − |jₖ₊₁ − jₖ| mod N)</w:t>
+        <w:t>L = (πD / N) Σₖ δ(jₖ, jₖ₊₁),   δ(a, b) = min((b − a) mod M, M − (b − a) mod M)</w:t>
       </w:r>
       <w:r>
         <w:tab/>
@@ -1243,7 +1296,49 @@
           <w:i w:val="0"/>
           <w:sz w:val="22"/>
         </w:rPr>
-        <w:t>With r equally spaced heads acting together, bolts j, j + N/r, … are tightened at one station, so a pass visits N/r stations and the travel is computed over that reduced sequence. Fig. 2 shows the 48-bolt star sequence and the resulting travel per pass: a single head covers 56 bolt-circle diameters per star pass on the bottom head, against 3.1 for a circular pass and 3.5 with four heads.</w:t>
+        <w:t>where M = N/r. With r equally spaced heads acting together, bolts j, j + N/r, … are tightened at one station, so a pass visits M stations, and the carriage reaches the next station by moving whichever head is nearest, i.e. the shortest way on a ring of M positions (for r = 1, M = N). Fig. 2 shows the 48-bolt star sequence and the resulting travel per pass: a single head covers 56 bolt-circle diameters per star pass on the bottom head, against 3.1 for a circular pass and 2.7 with four heads.</w:t>
+      </w:r>
+    </w:p>
+    <w:p>
+      <w:pPr>
+        <w:spacing w:line="360" w:lineRule="auto"/>
+        <w:ind w:firstLine="432"/>
+      </w:pPr>
+      <w:r>
+        <w:rPr>
+          <w:i w:val="0"/>
+          <w:sz w:val="22"/>
+        </w:rPr>
+        <w:t>Much of that travel might be regarded as wasted motion, so the tool path is also optimised. Let the quartets g = 0, …, q − 1 (q = N/4) be visited in an order π; each quartet is worked as g, g + 2q, g + q, g + 3q, so that opposite bolts are loaded consecutively as the legacy procedure requires. The optimised order solves</w:t>
+      </w:r>
+    </w:p>
+    <w:p>
+      <w:pPr>
+        <w:spacing w:line="288" w:lineRule="auto"/>
+        <w:ind w:left="864"/>
+      </w:pPr>
+      <w:r>
+        <w:rPr>
+          <w:i/>
+        </w:rPr>
+        <w:t>min over π of Σₖ c(πₖ, πₖ₊₁)   subject to   δ_q(πₖ, πₖ₊₁) ≥ s_min for all k</w:t>
+      </w:r>
+      <w:r>
+        <w:tab/>
+        <w:tab/>
+        <w:t>(4)</w:t>
+      </w:r>
+    </w:p>
+    <w:p>
+      <w:pPr>
+        <w:spacing w:line="360" w:lineRule="auto"/>
+      </w:pPr>
+      <w:r>
+        <w:rPr>
+          <w:i w:val="0"/>
+          <w:sz w:val="22"/>
+        </w:rPr>
+        <w:t>where c is the carriage travel from the last bolt of one quartet to the first of the next plus the travel within the next quartet, and δ_q is the separation of two quartets on the ring of q positions. The load-spreading constraint requires every consecutive pair of quartets to be at least as far apart as the closest consecutive pair in the legacy sequence (s_min = 2 for the top and bottom heads), so the optimised path never concentrates load more locally than the legacy path does at any step. The problem is a constrained shortest Hamiltonian path on at most q = 12 nodes and is solved exactly by dynamic programming (Held–Karp). Whether a sequence that satisfies this geometric constraint also preserves preload uniformity under elastic interaction must be established experimentally [3, 9].</w:t>
       </w:r>
     </w:p>
     <w:p>
@@ -1335,7 +1430,7 @@
       <w:r>
         <w:tab/>
         <w:tab/>
-        <w:t>(4)</w:t>
+        <w:t>(5)</w:t>
       </w:r>
     </w:p>
     <w:p>
@@ -1364,7 +1459,7 @@
       <w:r>
         <w:tab/>
         <w:tab/>
-        <w:t>(5)</w:t>
+        <w:t>(6)</w:t>
       </w:r>
     </w:p>
     <w:p>
@@ -1376,7 +1471,77 @@
           <w:i w:val="0"/>
           <w:sz w:val="22"/>
         </w:rPr>
-        <w:t>Run-on and run-off take the time to turn the nut through its engagement length, t_spin = 60·(1.5d/P)/n_spin, with P the ISO coarse pitch [32] and n_spin the spin speed in rev/min. Opening is one staged breakout pass in star order, a circular run-off pass and transfer of every bolt to the carousel; closing is transfer from the carousel, a circular run-on pass, three star passes at increasing torque and one to three circular check passes, following the legacy procedure [1]. The carousel serves one bolt at a time, so transfer time is N·t_transfer regardless of r. Flanges are either worked in parallel, each by its own runner, or in series. The full operation adds atmosphere confirmation, head handling, gasket work and the leak test.</w:t>
+        <w:t>Run-on and run-off take the time to turn the nut through its engagement length, t_spin = 60·(1.5d/P)/n_spin, with P the ISO coarse pitch [32] and n_spin the spin speed in rev/min. Opening is one staged breakout pass in star order, a circular run-off pass and transfer of every bolt to the carousel; closing is transfer from the carousel, a circular run-on pass, three star passes at increasing torque and one to three circular check passes, following the legacy procedure [1]. Bolt transfer between the flange and the carousel takes N·t_transfer/c, where c is the number of transfer channels working in parallel: c = 1 for a single carousel serving one bolt at a time, c = r when each torque head has its own feed point. Flanges are either worked in parallel, each by its own runner, or in series.</w:t>
+      </w:r>
+    </w:p>
+    <w:p>
+      <w:pPr>
+        <w:spacing w:line="360" w:lineRule="auto"/>
+      </w:pPr>
+      <w:r>
+        <w:rPr>
+          <w:i w:val="0"/>
+          <w:sz w:val="22"/>
+        </w:rPr>
+        <w:t>Two cycle times are distinguished. The bolting time is the time to unbolt and re-bolt all 92 bolts, the quantity to which the source proposal's 1.5–2.5 h target referred:</w:t>
+      </w:r>
+    </w:p>
+    <w:p>
+      <w:pPr>
+        <w:spacing w:line="288" w:lineRule="auto"/>
+        <w:ind w:left="864"/>
+      </w:pPr>
+      <w:r>
+        <w:rPr>
+          <w:i/>
+        </w:rPr>
+        <w:t>T_bolting = max_f T_open,f + max_f T_close,f</w:t>
+      </w:r>
+      <w:r>
+        <w:tab/>
+        <w:tab/>
+        <w:t>(7)</w:t>
+      </w:r>
+    </w:p>
+    <w:p>
+      <w:pPr>
+        <w:spacing w:line="360" w:lineRule="auto"/>
+      </w:pPr>
+      <w:r>
+        <w:rPr>
+          <w:i w:val="0"/>
+          <w:sz w:val="22"/>
+        </w:rPr>
+        <w:t>The complete operation adds atmosphere confirmation, head handling, gasket and face work and the steam leak test. In a phase-synchronised schedule every flange finishes a phase before the next begins; in a pipelined schedule each flange runs its own chain and only the leak test waits for all of them:</w:t>
+      </w:r>
+    </w:p>
+    <w:p>
+      <w:pPr>
+        <w:spacing w:line="288" w:lineRule="auto"/>
+        <w:ind w:left="864"/>
+      </w:pPr>
+      <w:r>
+        <w:rPr>
+          <w:i/>
+        </w:rPr>
+        <w:t>T_complete = t_atmos + max_f(T_open,f + t_head,f) + max_f(t_gasket + t_head,f + T_close,f) + t_leak</w:t>
+      </w:r>
+      <w:r>
+        <w:tab/>
+        <w:tab/>
+        <w:t>(8)</w:t>
+      </w:r>
+    </w:p>
+    <w:p>
+      <w:pPr>
+        <w:spacing w:line="360" w:lineRule="auto"/>
+      </w:pPr>
+      <w:r>
+        <w:rPr>
+          <w:i w:val="0"/>
+          <w:sz w:val="22"/>
+        </w:rPr>
+        <w:t>with t_head,f = 0 for the feed inlet. Hydraulic decoking, which separates opening from closing, is excluded from both.</w:t>
       </w:r>
     </w:p>
     <w:tbl>
@@ -2434,7 +2599,7 @@
           <w:i w:val="0"/>
           <w:sz w:val="22"/>
         </w:rPr>
-        <w:t>All inputs in Table 2, the spacing factor k and the position of each bolt size within its range are sampled independently 20000 times with a fixed seed (20260925). Six configurations are compared: one head with flanges in parallel, in series, and with circular passes only; two heads; four heads; and four heads with two instead of three star passes, as an example of a reduced-pass procedure of the kind permitted as an alternative to the legacy sequence [7]. Sensitivity is measured by the Spearman rank correlation between each sampled input and the total bolting time. A best case, with every step at the fast end of its range, bounds what each configuration could achieve. Discrete-event simulation of this kind is standard for evaluating manufacturing designs before they are built [31].</w:t>
+        <w:t>All inputs in Table 2, the spacing factor k and the position of each bolt size within its range are sampled independently 20000 times with a fixed seed (20260925). Six configurations are compared: one head with flanges in parallel, in series, and with circular passes only; two heads; four heads; and four heads with two instead of three star passes, as an example of a reduced-pass procedure of the kind permitted as an alternative to the legacy sequence [7]. Sensitivity is measured by the Spearman rank correlation between each sampled input and the total bolting time. A best case, with every step at the fast end of its range, bounds what each configuration could achieve. A second study then removes the bottlenecks of the four-head design one at a time, on the same samples: (A) four heads and a single carousel; (B) one transfer channel per head; (C) two star passes; (D) the optimised tool path; (E) pipelined servicing. Discrete-event simulation of this kind is standard for evaluating manufacturing designs before they are built [31].</w:t>
       </w:r>
     </w:p>
     <w:p>
@@ -2476,7 +2641,7 @@
       <w:r>
         <w:tab/>
         <w:tab/>
-        <w:t>(6)</w:t>
+        <w:t>(9)</w:t>
       </w:r>
     </w:p>
     <w:p>
@@ -2505,7 +2670,7 @@
       <w:r>
         <w:tab/>
         <w:tab/>
-        <w:t>(7)</w:t>
+        <w:t>(10)</w:t>
       </w:r>
     </w:p>
     <w:p>
@@ -2534,7 +2699,7 @@
       <w:r>
         <w:tab/>
         <w:tab/>
-        <w:t>(8)</w:t>
+        <w:t>(11)</w:t>
       </w:r>
     </w:p>
     <w:p>
@@ -2588,7 +2753,7 @@
       <w:r>
         <w:tab/>
         <w:tab/>
-        <w:t>(9)</w:t>
+        <w:t>(12)</w:t>
       </w:r>
     </w:p>
     <w:p>
@@ -2717,7 +2882,7 @@
       <w:r>
         <w:tab/>
         <w:tab/>
-        <w:t>(10)</w:t>
+        <w:t>(13)</w:t>
       </w:r>
     </w:p>
     <w:p>
@@ -3812,7 +3977,7 @@
               <w:rPr>
                 <w:sz w:val="17"/>
               </w:rPr>
-              <w:t>1.16</w:t>
+              <w:t>1.14</w:t>
             </w:r>
           </w:p>
         </w:tc>
@@ -3829,7 +3994,7 @@
               <w:rPr>
                 <w:sz w:val="17"/>
               </w:rPr>
-              <w:t>2.91</w:t>
+              <w:t>2.84</w:t>
             </w:r>
           </w:p>
         </w:tc>
@@ -3846,7 +4011,7 @@
               <w:rPr>
                 <w:sz w:val="17"/>
               </w:rPr>
-              <w:t>4.08 [3.16–5.20]</w:t>
+              <w:t>3.99 [3.10–5.06]</w:t>
             </w:r>
           </w:p>
         </w:tc>
@@ -3880,7 +4045,7 @@
               <w:rPr>
                 <w:sz w:val="17"/>
               </w:rPr>
-              <w:t>1.51</w:t>
+              <w:t>1.48</w:t>
             </w:r>
           </w:p>
         </w:tc>
@@ -3933,7 +4098,7 @@
               <w:rPr>
                 <w:sz w:val="17"/>
               </w:rPr>
-              <w:t>1.58</w:t>
+              <w:t>1.56</w:t>
             </w:r>
           </w:p>
         </w:tc>
@@ -3950,7 +4115,7 @@
               <w:rPr>
                 <w:sz w:val="17"/>
               </w:rPr>
-              <w:t>2.31 [1.76–2.93]</w:t>
+              <w:t>2.28 [1.74–2.90]</w:t>
             </w:r>
           </w:p>
         </w:tc>
@@ -3967,7 +4132,7 @@
               <w:rPr>
                 <w:sz w:val="17"/>
               </w:rPr>
-              <w:t>0.70</w:t>
+              <w:t>0.73</w:t>
             </w:r>
           </w:p>
         </w:tc>
@@ -3984,7 +4149,7 @@
               <w:rPr>
                 <w:sz w:val="17"/>
               </w:rPr>
-              <w:t>0.85</w:t>
+              <w:t>0.84</w:t>
             </w:r>
           </w:p>
         </w:tc>
@@ -4037,7 +4202,7 @@
               <w:rPr>
                 <w:sz w:val="17"/>
               </w:rPr>
-              <w:t>1.35</w:t>
+              <w:t>1.34</w:t>
             </w:r>
           </w:p>
         </w:tc>
@@ -4054,7 +4219,7 @@
               <w:rPr>
                 <w:sz w:val="17"/>
               </w:rPr>
-              <w:t>2.08 [1.57–2.66]</w:t>
+              <w:t>2.06 [1.55–2.64]</w:t>
             </w:r>
           </w:p>
         </w:tc>
@@ -4071,7 +4236,7 @@
               <w:rPr>
                 <w:sz w:val="17"/>
               </w:rPr>
-              <w:t>0.89</w:t>
+              <w:t>0.90</w:t>
             </w:r>
           </w:p>
         </w:tc>
@@ -4165,7 +4330,7 @@
           <w:i w:val="0"/>
           <w:sz w:val="22"/>
         </w:rPr>
-        <w:t>With one head per flange and the flanges worked in parallel, bolting takes 7.96 h (90% interval 6.09–10.51 h), set by the bottom head. Working the flanges in series nearly doubles this to 14.5 h, and using only circular passes, which would not satisfy the legacy procedure, still leaves 6.3 h. Most importantly, the single-head configuration cannot meet the 2.5 h target even in its best case of 2.96 h. A second head per flange halves the time to 4.1 h. Only four synchronised heads bring the median within the target, at 2.31 h (90% interval 1.76–2.93 h), and even then the target is met in 70% of samples; four heads with one fewer star pass raise this to 89%. Including head handling, gasket work and the leak test, the full opening and closing operation takes 9.8 h with one head and 4.2 h with four.</w:t>
+        <w:t>With one head per flange and the flanges worked in parallel, bolting takes 7.96 h (90% interval 6.09–10.51 h), set by the bottom head. Working the flanges in series nearly doubles this to 14.5 h, and using only circular passes, which would not satisfy the legacy procedure, still leaves 6.3 h. Most importantly, the single-head configuration cannot meet the 2.5 h target even in its best case of 2.96 h. A second head per flange halves the time to 4.0 h. Only four synchronised heads bring the median within the target, at 2.28 h (90% interval 1.74–2.90 h), and even then the target is met in 73% of samples; four heads with one fewer star pass raise this to 90%. Including head handling, gasket work and the leak test, the full opening and closing operation takes 9.8 h with one head and 4.1 h with four.</w:t>
       </w:r>
     </w:p>
     <w:p>
@@ -4215,7 +4380,7 @@
           <w:i w:val="0"/>
           <w:sz w:val="22"/>
         </w:rPr>
-        <w:t>With one head (Fig. 5a) the time is driven by carriage speed (ρ = -0.54), torque time per pass (0.43) and the number of check passes (0.43): the single head spends much of the pass travelling the star pattern. With four heads (Fig. 5b) travel almost disappears and the ranking changes: carousel transfer becomes the strongest driver (ρ = 0.54), followed by check passes (0.46) and torque time (0.42), and the probability of an operator review rises in importance because any one of four heads can stall a station. Carousel transfer accounts for 26% of bottom-head bolting time in the four-head configuration. A design with four heads must therefore also increase carousel throughput, for example with a feed point per head; otherwise the carousel, not the torque tool, sets the pace.</w:t>
+        <w:t>With one head (Fig. 5a) the time is driven by carriage speed (ρ = -0.54), torque time per pass (0.43) and the number of check passes (0.43): the single head spends much of the pass travelling the star pattern. With four heads (Fig. 5b) travel almost disappears and the ranking changes: carousel transfer becomes the strongest driver (ρ = 0.55), followed by check passes (0.46) and torque time (0.42), and the probability of an operator review rises in importance because any one of four heads can stall a station. Carousel transfer accounts for 26% of bottom-head bolting time in the four-head configuration. A design with four heads must therefore also increase carousel throughput, for example with a feed point per head; otherwise the carousel, not the torque tool, sets the pace.</w:t>
       </w:r>
     </w:p>
     <w:p>
@@ -4277,7 +4442,767 @@
           <w:b/>
           <w:sz w:val="22"/>
         </w:rPr>
-        <w:t>5.5 Preload</w:t>
+        <w:t>5.5 Throughput-optimised architecture</w:t>
+      </w:r>
+    </w:p>
+    <w:tbl>
+      <w:tblPr>
+        <w:tblStyle w:val="TableGrid"/>
+        <w:tblW w:type="auto" w:w="0"/>
+        <w:tblLook w:firstColumn="1" w:firstRow="1" w:lastColumn="0" w:lastRow="0" w:noHBand="0" w:noVBand="1" w:val="04A0"/>
+      </w:tblPr>
+      <w:tblGrid>
+        <w:gridCol w:w="1560"/>
+        <w:gridCol w:w="1560"/>
+        <w:gridCol w:w="1560"/>
+        <w:gridCol w:w="1560"/>
+        <w:gridCol w:w="1560"/>
+        <w:gridCol w:w="1560"/>
+      </w:tblGrid>
+      <w:tr>
+        <w:tc>
+          <w:tcPr>
+            <w:tcW w:type="dxa" w:w="2880"/>
+          </w:tcPr>
+          <w:p>
+            <w:pPr>
+              <w:spacing w:line="240" w:lineRule="auto"/>
+            </w:pPr>
+            <w:r/>
+            <w:r>
+              <w:rPr>
+                <w:b/>
+                <w:sz w:val="17"/>
+              </w:rPr>
+              <w:t>Configuration</w:t>
+            </w:r>
+          </w:p>
+        </w:tc>
+        <w:tc>
+          <w:tcPr>
+            <w:tcW w:type="dxa" w:w="1728"/>
+          </w:tcPr>
+          <w:p>
+            <w:pPr>
+              <w:spacing w:line="240" w:lineRule="auto"/>
+            </w:pPr>
+            <w:r/>
+            <w:r>
+              <w:rPr>
+                <w:b/>
+                <w:sz w:val="17"/>
+              </w:rPr>
+              <w:t>Bolting (h)</w:t>
+            </w:r>
+          </w:p>
+        </w:tc>
+        <w:tc>
+          <w:tcPr>
+            <w:tcW w:type="dxa" w:w="1152"/>
+          </w:tcPr>
+          <w:p>
+            <w:pPr>
+              <w:spacing w:line="240" w:lineRule="auto"/>
+            </w:pPr>
+            <w:r/>
+            <w:r>
+              <w:rPr>
+                <w:b/>
+                <w:sz w:val="17"/>
+              </w:rPr>
+              <w:t>P(bolting ≤ 2.5 h)</w:t>
+            </w:r>
+          </w:p>
+        </w:tc>
+        <w:tc>
+          <w:tcPr>
+            <w:tcW w:type="dxa" w:w="1872"/>
+          </w:tcPr>
+          <w:p>
+            <w:pPr>
+              <w:spacing w:line="240" w:lineRule="auto"/>
+            </w:pPr>
+            <w:r/>
+            <w:r>
+              <w:rPr>
+                <w:b/>
+                <w:sz w:val="17"/>
+              </w:rPr>
+              <w:t>Complete operation (h)</w:t>
+            </w:r>
+          </w:p>
+        </w:tc>
+        <w:tc>
+          <w:tcPr>
+            <w:tcW w:type="dxa" w:w="1152"/>
+          </w:tcPr>
+          <w:p>
+            <w:pPr>
+              <w:spacing w:line="240" w:lineRule="auto"/>
+            </w:pPr>
+            <w:r/>
+            <w:r>
+              <w:rPr>
+                <w:b/>
+                <w:sz w:val="17"/>
+              </w:rPr>
+              <w:t>P(complete ≤ 2.5 h)</w:t>
+            </w:r>
+          </w:p>
+        </w:tc>
+        <w:tc>
+          <w:tcPr>
+            <w:tcW w:type="dxa" w:w="1152"/>
+          </w:tcPr>
+          <w:p>
+            <w:pPr>
+              <w:spacing w:line="240" w:lineRule="auto"/>
+            </w:pPr>
+            <w:r/>
+            <w:r>
+              <w:rPr>
+                <w:b/>
+                <w:sz w:val="17"/>
+              </w:rPr>
+              <w:t>P(complete ≤ 4 h)</w:t>
+            </w:r>
+          </w:p>
+        </w:tc>
+      </w:tr>
+      <w:tr>
+        <w:tc>
+          <w:tcPr>
+            <w:tcW w:type="dxa" w:w="2880"/>
+          </w:tcPr>
+          <w:p>
+            <w:pPr>
+              <w:spacing w:line="240" w:lineRule="auto" w:after="0"/>
+            </w:pPr>
+            <w:r/>
+            <w:r>
+              <w:rPr>
+                <w:sz w:val="17"/>
+              </w:rPr>
+              <w:t>One head (baseline)</w:t>
+            </w:r>
+          </w:p>
+        </w:tc>
+        <w:tc>
+          <w:tcPr>
+            <w:tcW w:type="dxa" w:w="1728"/>
+          </w:tcPr>
+          <w:p>
+            <w:pPr>
+              <w:spacing w:line="240" w:lineRule="auto" w:after="0"/>
+            </w:pPr>
+            <w:r/>
+            <w:r>
+              <w:rPr>
+                <w:sz w:val="17"/>
+              </w:rPr>
+              <w:t>7.96 [6.09–10.51]</w:t>
+            </w:r>
+          </w:p>
+        </w:tc>
+        <w:tc>
+          <w:tcPr>
+            <w:tcW w:type="dxa" w:w="1152"/>
+          </w:tcPr>
+          <w:p>
+            <w:pPr>
+              <w:spacing w:line="240" w:lineRule="auto" w:after="0"/>
+            </w:pPr>
+            <w:r/>
+            <w:r>
+              <w:rPr>
+                <w:sz w:val="17"/>
+              </w:rPr>
+              <w:t>0.00</w:t>
+            </w:r>
+          </w:p>
+        </w:tc>
+        <w:tc>
+          <w:tcPr>
+            <w:tcW w:type="dxa" w:w="1872"/>
+          </w:tcPr>
+          <w:p>
+            <w:pPr>
+              <w:spacing w:line="240" w:lineRule="auto" w:after="0"/>
+            </w:pPr>
+            <w:r/>
+            <w:r>
+              <w:rPr>
+                <w:sz w:val="17"/>
+              </w:rPr>
+              <w:t>9.81 [7.91–12.41]</w:t>
+            </w:r>
+          </w:p>
+        </w:tc>
+        <w:tc>
+          <w:tcPr>
+            <w:tcW w:type="dxa" w:w="1152"/>
+          </w:tcPr>
+          <w:p>
+            <w:pPr>
+              <w:spacing w:line="240" w:lineRule="auto" w:after="0"/>
+            </w:pPr>
+            <w:r/>
+            <w:r>
+              <w:rPr>
+                <w:sz w:val="17"/>
+              </w:rPr>
+              <w:t>0.00</w:t>
+            </w:r>
+          </w:p>
+        </w:tc>
+        <w:tc>
+          <w:tcPr>
+            <w:tcW w:type="dxa" w:w="1152"/>
+          </w:tcPr>
+          <w:p>
+            <w:pPr>
+              <w:spacing w:line="240" w:lineRule="auto" w:after="0"/>
+            </w:pPr>
+            <w:r/>
+            <w:r>
+              <w:rPr>
+                <w:sz w:val="17"/>
+              </w:rPr>
+              <w:t>0.00</w:t>
+            </w:r>
+          </w:p>
+        </w:tc>
+      </w:tr>
+      <w:tr>
+        <w:tc>
+          <w:tcPr>
+            <w:tcW w:type="dxa" w:w="2880"/>
+          </w:tcPr>
+          <w:p>
+            <w:pPr>
+              <w:spacing w:line="240" w:lineRule="auto" w:after="0"/>
+            </w:pPr>
+            <w:r/>
+            <w:r>
+              <w:rPr>
+                <w:sz w:val="17"/>
+              </w:rPr>
+              <w:t>A  Four heads, single carousel</w:t>
+            </w:r>
+          </w:p>
+        </w:tc>
+        <w:tc>
+          <w:tcPr>
+            <w:tcW w:type="dxa" w:w="1728"/>
+          </w:tcPr>
+          <w:p>
+            <w:pPr>
+              <w:spacing w:line="240" w:lineRule="auto" w:after="0"/>
+            </w:pPr>
+            <w:r/>
+            <w:r>
+              <w:rPr>
+                <w:sz w:val="17"/>
+              </w:rPr>
+              <w:t>2.28 [1.74–2.90]</w:t>
+            </w:r>
+          </w:p>
+        </w:tc>
+        <w:tc>
+          <w:tcPr>
+            <w:tcW w:type="dxa" w:w="1152"/>
+          </w:tcPr>
+          <w:p>
+            <w:pPr>
+              <w:spacing w:line="240" w:lineRule="auto" w:after="0"/>
+            </w:pPr>
+            <w:r/>
+            <w:r>
+              <w:rPr>
+                <w:sz w:val="17"/>
+              </w:rPr>
+              <w:t>0.73</w:t>
+            </w:r>
+          </w:p>
+        </w:tc>
+        <w:tc>
+          <w:tcPr>
+            <w:tcW w:type="dxa" w:w="1872"/>
+          </w:tcPr>
+          <w:p>
+            <w:pPr>
+              <w:spacing w:line="240" w:lineRule="auto" w:after="0"/>
+            </w:pPr>
+            <w:r/>
+            <w:r>
+              <w:rPr>
+                <w:sz w:val="17"/>
+              </w:rPr>
+              <w:t>4.13 [3.47–4.86]</w:t>
+            </w:r>
+          </w:p>
+        </w:tc>
+        <w:tc>
+          <w:tcPr>
+            <w:tcW w:type="dxa" w:w="1152"/>
+          </w:tcPr>
+          <w:p>
+            <w:pPr>
+              <w:spacing w:line="240" w:lineRule="auto" w:after="0"/>
+            </w:pPr>
+            <w:r/>
+            <w:r>
+              <w:rPr>
+                <w:sz w:val="17"/>
+              </w:rPr>
+              <w:t>0.00</w:t>
+            </w:r>
+          </w:p>
+        </w:tc>
+        <w:tc>
+          <w:tcPr>
+            <w:tcW w:type="dxa" w:w="1152"/>
+          </w:tcPr>
+          <w:p>
+            <w:pPr>
+              <w:spacing w:line="240" w:lineRule="auto" w:after="0"/>
+            </w:pPr>
+            <w:r/>
+            <w:r>
+              <w:rPr>
+                <w:sz w:val="17"/>
+              </w:rPr>
+              <w:t>0.37</w:t>
+            </w:r>
+          </w:p>
+        </w:tc>
+      </w:tr>
+      <w:tr>
+        <w:tc>
+          <w:tcPr>
+            <w:tcW w:type="dxa" w:w="2880"/>
+          </w:tcPr>
+          <w:p>
+            <w:pPr>
+              <w:spacing w:line="240" w:lineRule="auto" w:after="0"/>
+            </w:pPr>
+            <w:r/>
+            <w:r>
+              <w:rPr>
+                <w:sz w:val="17"/>
+              </w:rPr>
+              <w:t>B  + four transfer channels</w:t>
+            </w:r>
+          </w:p>
+        </w:tc>
+        <w:tc>
+          <w:tcPr>
+            <w:tcW w:type="dxa" w:w="1728"/>
+          </w:tcPr>
+          <w:p>
+            <w:pPr>
+              <w:spacing w:line="240" w:lineRule="auto" w:after="0"/>
+            </w:pPr>
+            <w:r/>
+            <w:r>
+              <w:rPr>
+                <w:sz w:val="17"/>
+              </w:rPr>
+              <w:t>1.82 [1.38–2.37]</w:t>
+            </w:r>
+          </w:p>
+        </w:tc>
+        <w:tc>
+          <w:tcPr>
+            <w:tcW w:type="dxa" w:w="1152"/>
+          </w:tcPr>
+          <w:p>
+            <w:pPr>
+              <w:spacing w:line="240" w:lineRule="auto" w:after="0"/>
+            </w:pPr>
+            <w:r/>
+            <w:r>
+              <w:rPr>
+                <w:sz w:val="17"/>
+              </w:rPr>
+              <w:t>0.98</w:t>
+            </w:r>
+          </w:p>
+        </w:tc>
+        <w:tc>
+          <w:tcPr>
+            <w:tcW w:type="dxa" w:w="1872"/>
+          </w:tcPr>
+          <w:p>
+            <w:pPr>
+              <w:spacing w:line="240" w:lineRule="auto" w:after="0"/>
+            </w:pPr>
+            <w:r/>
+            <w:r>
+              <w:rPr>
+                <w:sz w:val="17"/>
+              </w:rPr>
+              <w:t>3.68 [3.09–4.33]</w:t>
+            </w:r>
+          </w:p>
+        </w:tc>
+        <w:tc>
+          <w:tcPr>
+            <w:tcW w:type="dxa" w:w="1152"/>
+          </w:tcPr>
+          <w:p>
+            <w:pPr>
+              <w:spacing w:line="240" w:lineRule="auto" w:after="0"/>
+            </w:pPr>
+            <w:r/>
+            <w:r>
+              <w:rPr>
+                <w:sz w:val="17"/>
+              </w:rPr>
+              <w:t>0.00</w:t>
+            </w:r>
+          </w:p>
+        </w:tc>
+        <w:tc>
+          <w:tcPr>
+            <w:tcW w:type="dxa" w:w="1152"/>
+          </w:tcPr>
+          <w:p>
+            <w:pPr>
+              <w:spacing w:line="240" w:lineRule="auto" w:after="0"/>
+            </w:pPr>
+            <w:r/>
+            <w:r>
+              <w:rPr>
+                <w:sz w:val="17"/>
+              </w:rPr>
+              <w:t>0.80</w:t>
+            </w:r>
+          </w:p>
+        </w:tc>
+      </w:tr>
+      <w:tr>
+        <w:tc>
+          <w:tcPr>
+            <w:tcW w:type="dxa" w:w="2880"/>
+          </w:tcPr>
+          <w:p>
+            <w:pPr>
+              <w:spacing w:line="240" w:lineRule="auto" w:after="0"/>
+            </w:pPr>
+            <w:r/>
+            <w:r>
+              <w:rPr>
+                <w:sz w:val="17"/>
+              </w:rPr>
+              <w:t>C  + two star passes</w:t>
+            </w:r>
+          </w:p>
+        </w:tc>
+        <w:tc>
+          <w:tcPr>
+            <w:tcW w:type="dxa" w:w="1728"/>
+          </w:tcPr>
+          <w:p>
+            <w:pPr>
+              <w:spacing w:line="240" w:lineRule="auto" w:after="0"/>
+            </w:pPr>
+            <w:r/>
+            <w:r>
+              <w:rPr>
+                <w:sz w:val="17"/>
+              </w:rPr>
+              <w:t>1.60 [1.21–2.10]</w:t>
+            </w:r>
+          </w:p>
+        </w:tc>
+        <w:tc>
+          <w:tcPr>
+            <w:tcW w:type="dxa" w:w="1152"/>
+          </w:tcPr>
+          <w:p>
+            <w:pPr>
+              <w:spacing w:line="240" w:lineRule="auto" w:after="0"/>
+            </w:pPr>
+            <w:r/>
+            <w:r>
+              <w:rPr>
+                <w:sz w:val="17"/>
+              </w:rPr>
+              <w:t>1.00</w:t>
+            </w:r>
+          </w:p>
+        </w:tc>
+        <w:tc>
+          <w:tcPr>
+            <w:tcW w:type="dxa" w:w="1872"/>
+          </w:tcPr>
+          <w:p>
+            <w:pPr>
+              <w:spacing w:line="240" w:lineRule="auto" w:after="0"/>
+            </w:pPr>
+            <w:r/>
+            <w:r>
+              <w:rPr>
+                <w:sz w:val="17"/>
+              </w:rPr>
+              <w:t>3.46 [2.91–4.08]</w:t>
+            </w:r>
+          </w:p>
+        </w:tc>
+        <w:tc>
+          <w:tcPr>
+            <w:tcW w:type="dxa" w:w="1152"/>
+          </w:tcPr>
+          <w:p>
+            <w:pPr>
+              <w:spacing w:line="240" w:lineRule="auto" w:after="0"/>
+            </w:pPr>
+            <w:r/>
+            <w:r>
+              <w:rPr>
+                <w:sz w:val="17"/>
+              </w:rPr>
+              <w:t>0.00</w:t>
+            </w:r>
+          </w:p>
+        </w:tc>
+        <w:tc>
+          <w:tcPr>
+            <w:tcW w:type="dxa" w:w="1152"/>
+          </w:tcPr>
+          <w:p>
+            <w:pPr>
+              <w:spacing w:line="240" w:lineRule="auto" w:after="0"/>
+            </w:pPr>
+            <w:r/>
+            <w:r>
+              <w:rPr>
+                <w:sz w:val="17"/>
+              </w:rPr>
+              <w:t>0.93</w:t>
+            </w:r>
+          </w:p>
+        </w:tc>
+      </w:tr>
+      <w:tr>
+        <w:tc>
+          <w:tcPr>
+            <w:tcW w:type="dxa" w:w="2880"/>
+          </w:tcPr>
+          <w:p>
+            <w:pPr>
+              <w:spacing w:line="240" w:lineRule="auto" w:after="0"/>
+            </w:pPr>
+            <w:r/>
+            <w:r>
+              <w:rPr>
+                <w:sz w:val="17"/>
+              </w:rPr>
+              <w:t>D  + optimised tool path</w:t>
+            </w:r>
+          </w:p>
+        </w:tc>
+        <w:tc>
+          <w:tcPr>
+            <w:tcW w:type="dxa" w:w="1728"/>
+          </w:tcPr>
+          <w:p>
+            <w:pPr>
+              <w:spacing w:line="240" w:lineRule="auto" w:after="0"/>
+            </w:pPr>
+            <w:r/>
+            <w:r>
+              <w:rPr>
+                <w:sz w:val="17"/>
+              </w:rPr>
+              <w:t>1.57 [1.18–2.07]</w:t>
+            </w:r>
+          </w:p>
+        </w:tc>
+        <w:tc>
+          <w:tcPr>
+            <w:tcW w:type="dxa" w:w="1152"/>
+          </w:tcPr>
+          <w:p>
+            <w:pPr>
+              <w:spacing w:line="240" w:lineRule="auto" w:after="0"/>
+            </w:pPr>
+            <w:r/>
+            <w:r>
+              <w:rPr>
+                <w:sz w:val="17"/>
+              </w:rPr>
+              <w:t>1.00</w:t>
+            </w:r>
+          </w:p>
+        </w:tc>
+        <w:tc>
+          <w:tcPr>
+            <w:tcW w:type="dxa" w:w="1872"/>
+          </w:tcPr>
+          <w:p>
+            <w:pPr>
+              <w:spacing w:line="240" w:lineRule="auto" w:after="0"/>
+            </w:pPr>
+            <w:r/>
+            <w:r>
+              <w:rPr>
+                <w:sz w:val="17"/>
+              </w:rPr>
+              <w:t>3.43 [2.88–4.04]</w:t>
+            </w:r>
+          </w:p>
+        </w:tc>
+        <w:tc>
+          <w:tcPr>
+            <w:tcW w:type="dxa" w:w="1152"/>
+          </w:tcPr>
+          <w:p>
+            <w:pPr>
+              <w:spacing w:line="240" w:lineRule="auto" w:after="0"/>
+            </w:pPr>
+            <w:r/>
+            <w:r>
+              <w:rPr>
+                <w:sz w:val="17"/>
+              </w:rPr>
+              <w:t>0.00</w:t>
+            </w:r>
+          </w:p>
+        </w:tc>
+        <w:tc>
+          <w:tcPr>
+            <w:tcW w:type="dxa" w:w="1152"/>
+          </w:tcPr>
+          <w:p>
+            <w:pPr>
+              <w:spacing w:line="240" w:lineRule="auto" w:after="0"/>
+            </w:pPr>
+            <w:r/>
+            <w:r>
+              <w:rPr>
+                <w:sz w:val="17"/>
+              </w:rPr>
+              <w:t>0.94</w:t>
+            </w:r>
+          </w:p>
+        </w:tc>
+      </w:tr>
+      <w:tr>
+        <w:tc>
+          <w:tcPr>
+            <w:tcW w:type="dxa" w:w="2880"/>
+          </w:tcPr>
+          <w:p>
+            <w:pPr>
+              <w:spacing w:line="240" w:lineRule="auto" w:after="0"/>
+            </w:pPr>
+            <w:r/>
+            <w:r>
+              <w:rPr>
+                <w:sz w:val="17"/>
+              </w:rPr>
+              <w:t>E  + pipelined servicing</w:t>
+            </w:r>
+          </w:p>
+        </w:tc>
+        <w:tc>
+          <w:tcPr>
+            <w:tcW w:type="dxa" w:w="1728"/>
+          </w:tcPr>
+          <w:p>
+            <w:pPr>
+              <w:spacing w:line="240" w:lineRule="auto" w:after="0"/>
+            </w:pPr>
+            <w:r/>
+            <w:r>
+              <w:rPr>
+                <w:sz w:val="17"/>
+              </w:rPr>
+              <w:t>1.57 [1.18–2.07]</w:t>
+            </w:r>
+          </w:p>
+        </w:tc>
+        <w:tc>
+          <w:tcPr>
+            <w:tcW w:type="dxa" w:w="1152"/>
+          </w:tcPr>
+          <w:p>
+            <w:pPr>
+              <w:spacing w:line="240" w:lineRule="auto" w:after="0"/>
+            </w:pPr>
+            <w:r/>
+            <w:r>
+              <w:rPr>
+                <w:sz w:val="17"/>
+              </w:rPr>
+              <w:t>1.00</w:t>
+            </w:r>
+          </w:p>
+        </w:tc>
+        <w:tc>
+          <w:tcPr>
+            <w:tcW w:type="dxa" w:w="1872"/>
+          </w:tcPr>
+          <w:p>
+            <w:pPr>
+              <w:spacing w:line="240" w:lineRule="auto" w:after="0"/>
+            </w:pPr>
+            <w:r/>
+            <w:r>
+              <w:rPr>
+                <w:sz w:val="17"/>
+              </w:rPr>
+              <w:t>3.43 [2.88–4.04]</w:t>
+            </w:r>
+          </w:p>
+        </w:tc>
+        <w:tc>
+          <w:tcPr>
+            <w:tcW w:type="dxa" w:w="1152"/>
+          </w:tcPr>
+          <w:p>
+            <w:pPr>
+              <w:spacing w:line="240" w:lineRule="auto" w:after="0"/>
+            </w:pPr>
+            <w:r/>
+            <w:r>
+              <w:rPr>
+                <w:sz w:val="17"/>
+              </w:rPr>
+              <w:t>0.00</w:t>
+            </w:r>
+          </w:p>
+        </w:tc>
+        <w:tc>
+          <w:tcPr>
+            <w:tcW w:type="dxa" w:w="1152"/>
+          </w:tcPr>
+          <w:p>
+            <w:pPr>
+              <w:spacing w:line="240" w:lineRule="auto" w:after="0"/>
+            </w:pPr>
+            <w:r/>
+            <w:r>
+              <w:rPr>
+                <w:sz w:val="17"/>
+              </w:rPr>
+              <w:t>0.94</w:t>
+            </w:r>
+          </w:p>
+        </w:tc>
+      </w:tr>
+    </w:tbl>
+    <w:p>
+      <w:pPr>
+        <w:spacing w:line="240" w:lineRule="auto" w:after="200"/>
+      </w:pPr>
+      <w:r>
+        <w:rPr>
+          <w:sz w:val="19"/>
+        </w:rPr>
+        <w:t>Table 5. Removing the bottlenecks of the automated architecture one at a time (median and 5th–95th percentiles, same Monte Carlo samples throughout). Each row adds one change to the row above.</w:t>
       </w:r>
     </w:p>
     <w:p>
@@ -4290,17 +5215,43 @@
           <w:i w:val="0"/>
           <w:sz w:val="22"/>
         </w:rPr>
-        <w:t>Fig. 6a shows that the ±2% torque accuracy stated for the system has almost no effect on preload scatter. With CV_K = 10%, preload CV is 10.4% for a ±2% tool, 10.7% for ±5% and 11.8% for ±10%; 32% of bolts fall outside ±10% of target even with the ±2% tool. Preload scatter is set by the nut factor, as the torque–tension literature leads one to expect [10–12]. The angle channel is what changes the outcome (Fig. 6b): with an angle-based preload estimate of 3% uncertainty and re-torque of bolts outside ±10%, the fraction outside falls from 32% to 5% (CV_K = 10%) and from 50% to 5% (CV_K = 15%), at the cost of re-torquing 34% and 51% of bolts respectively. With a 5% angle-estimate uncertainty the residual is about 10%; with 8% the benefit largely disappears. The value of torque–angle monitoring therefore depends on how well joint stiffness is known, which the validation plan measures.</w:t>
+        <w:t>Table 5 and Fig. 6 remove the bottlenecks in turn. Giving each of the four heads its own bolt-transfer channel, for example a carousel with four access stations, cuts bolting from 2.28 to 1.82 h and raises the probability of meeting 2.5 h from 0.73 to 0.98. Removing one star pass brings bolting to 1.60 h, inside the target in every sample; this is a change to the joint-assembly procedure, not to the machine, and is admissible only if a reduced-pass procedure of the kind described as an alternative to the legacy sequence [7] is shown to give equivalent preload uniformity on the actual joint (Section 7). With these two changes the parallelisation is complete: the torque heads, the bolt handling and the passes all scale together.</w:t>
       </w:r>
     </w:p>
     <w:p>
       <w:pPr>
+        <w:spacing w:line="360" w:lineRule="auto"/>
+        <w:ind w:firstLine="432"/>
+      </w:pPr>
+      <w:r>
+        <w:rPr>
+          <w:i w:val="0"/>
+          <w:sz w:val="22"/>
+        </w:rPr>
+        <w:t>The exactly optimised tool path adds little. With four heads it cuts carriage travel per star pass on the bottom head from 2.68 to 1.51 bolt-circle diameters, but travel is by then a small part of the cycle and bolting falls only from 1.60 to 1.57 h. With one head, where travel matters, the optimum reduces travel per star pass only from 56.5 to 55.0 diameters and bolting from 7.96 to 7.91 h. The reason is structural: most of the single-head travel is incurred within each quartet, because opposite bolts, half a turn apart, must be loaded consecutively, and no ordering of the quartets can remove that. The wasted motion of Fig. 2 is thus a consequence of serving a symmetric loading rule with one tool, and the remedy is more tools rather than a better path. Pipelining the servicing steps changes nothing (3.43 h in both D and E) because the bottom head, with the most bolts and a head to handle, is on the critical path in every phase, so the other flanges' chains finish within it.</w:t>
+      </w:r>
+    </w:p>
+    <w:p>
+      <w:pPr>
+        <w:spacing w:line="360" w:lineRule="auto"/>
+        <w:ind w:firstLine="432"/>
+      </w:pPr>
+      <w:r>
+        <w:rPr>
+          <w:i w:val="0"/>
+          <w:sz w:val="22"/>
+        </w:rPr>
+        <w:t>The complete operation is a different matter. Even in configuration E it takes 3.43 h (90% interval 2.88–4.04 h) and meets 2.5 h in none of the 20000 samples. Of the median, 1.57 h is bolting and 1.85 h is servicing: head handling in both directions (0.75 h), the leak test (0.54 h), gasket and face work (0.46 h) and atmosphere confirmation (0.10 h). For the complete operation to fit in 2.5 h with bolting at 1.57 h, the servicing steps would have to total 0.93 h, less than their 1.12 h minimum within the assumed ranges. The 2.5 h target is therefore achievable for bolting, which is what the source proposal stated, but not for the complete operation; once bolting is parallelised, head handling and the leak test become the next bottlenecks.</w:t>
+      </w:r>
+    </w:p>
+    <w:p>
+      <w:pPr>
         <w:jc w:val="center"/>
       </w:pPr>
       <w:r>
         <w:drawing>
           <wp:inline xmlns:a="http://schemas.openxmlformats.org/drawingml/2006/main" xmlns:pic="http://schemas.openxmlformats.org/drawingml/2006/picture">
-            <wp:extent cx="5760720" cy="2311942"/>
+            <wp:extent cx="5760720" cy="2345090"/>
             <wp:docPr id="6" name="Picture 6"/>
             <wp:cNvGraphicFramePr>
               <a:graphicFrameLocks noChangeAspect="1"/>
@@ -4309,11 +5260,86 @@
               <a:graphicData uri="http://schemas.openxmlformats.org/drawingml/2006/picture">
                 <pic:pic>
                   <pic:nvPicPr>
-                    <pic:cNvPr id="0" name="figure6_preload.png"/>
+                    <pic:cNvPr id="0" name="figure6_optimisation.png"/>
                     <pic:cNvPicPr/>
                   </pic:nvPicPr>
                   <pic:blipFill>
                     <a:blip r:embed="rId14"/>
+                    <a:stretch>
+                      <a:fillRect/>
+                    </a:stretch>
+                  </pic:blipFill>
+                  <pic:spPr>
+                    <a:xfrm>
+                      <a:off x="0" y="0"/>
+                      <a:ext cx="5760720" cy="2345090"/>
+                    </a:xfrm>
+                    <a:prstGeom prst="rect"/>
+                  </pic:spPr>
+                </pic:pic>
+              </a:graphicData>
+            </a:graphic>
+          </wp:inline>
+        </w:drawing>
+      </w:r>
+    </w:p>
+    <w:p>
+      <w:pPr>
+        <w:spacing w:line="240" w:lineRule="auto" w:after="200"/>
+      </w:pPr>
+      <w:r>
+        <w:rPr>
+          <w:sz w:val="19"/>
+        </w:rPr>
+        <w:t>Fig. 6 (a) Bolting time and (b) complete-operation time as the bottlenecks are removed one at a time (Table 5). Shading marks 2.5 h; labels give the median and the probability of meeting 2.5 h.</w:t>
+      </w:r>
+    </w:p>
+    <w:p>
+      <w:pPr>
+        <w:spacing w:before="160" w:after="80"/>
+      </w:pPr>
+      <w:r>
+        <w:rPr>
+          <w:b/>
+          <w:sz w:val="22"/>
+        </w:rPr>
+        <w:t>5.6 Preload</w:t>
+      </w:r>
+    </w:p>
+    <w:p>
+      <w:pPr>
+        <w:spacing w:line="360" w:lineRule="auto"/>
+        <w:ind w:firstLine="432"/>
+      </w:pPr>
+      <w:r>
+        <w:rPr>
+          <w:i w:val="0"/>
+          <w:sz w:val="22"/>
+        </w:rPr>
+        <w:t>Fig. 7a shows that the ±2% torque accuracy stated for the system has almost no effect on preload scatter. With CV_K = 10%, preload CV is 10.4% for a ±2% tool, 10.7% for ±5% and 11.8% for ±10%; 32% of bolts fall outside ±10% of target even with the ±2% tool. Preload scatter is set by the nut factor, as the torque–tension literature leads one to expect [10–12]. The angle channel is what changes the outcome (Fig. 7b): with an angle-based preload estimate of 3% uncertainty and re-torque of bolts outside ±10%, the fraction outside falls from 32% to 5% (CV_K = 10%) and from 50% to 5% (CV_K = 15%), at the cost of re-torquing 34% and 51% of bolts respectively. With a 5% angle-estimate uncertainty the residual is about 10%; with 8% the benefit largely disappears. The value of torque–angle monitoring therefore depends on how well joint stiffness is known, which the validation plan measures.</w:t>
+      </w:r>
+    </w:p>
+    <w:p>
+      <w:pPr>
+        <w:jc w:val="center"/>
+      </w:pPr>
+      <w:r>
+        <w:drawing>
+          <wp:inline xmlns:a="http://schemas.openxmlformats.org/drawingml/2006/main" xmlns:pic="http://schemas.openxmlformats.org/drawingml/2006/picture">
+            <wp:extent cx="5760720" cy="2311942"/>
+            <wp:docPr id="7" name="Picture 7"/>
+            <wp:cNvGraphicFramePr>
+              <a:graphicFrameLocks noChangeAspect="1"/>
+            </wp:cNvGraphicFramePr>
+            <a:graphic>
+              <a:graphicData uri="http://schemas.openxmlformats.org/drawingml/2006/picture">
+                <pic:pic>
+                  <pic:nvPicPr>
+                    <pic:cNvPr id="0" name="figure7_preload.png"/>
+                    <pic:cNvPicPr/>
+                  </pic:nvPicPr>
+                  <pic:blipFill>
+                    <a:blip r:embed="rId15"/>
                     <a:stretch>
                       <a:fillRect/>
                     </a:stretch>
@@ -4340,7 +5366,7 @@
         <w:rPr>
           <w:sz w:val="19"/>
         </w:rPr>
-        <w:t>Fig. 6 (a) Achieved preload coefficient of variation against nut-factor variation for three tool accuracies. (b) Fraction of bolts outside ±10% of target under torque control alone and with torque–angle re-torque, for two nut-factor scatters and three angle-estimate uncertainties.</w:t>
+        <w:t>Fig. 7 (a) Achieved preload coefficient of variation against nut-factor variation for three tool accuracies. (b) Fraction of bolts outside ±10% of target under torque control alone and with torque–angle re-torque, for two nut-factor scatters and three angle-estimate uncertainties.</w:t>
       </w:r>
     </w:p>
     <w:p>
@@ -4352,7 +5378,7 @@
           <w:b/>
           <w:sz w:val="22"/>
         </w:rPr>
-        <w:t>5.6 Head handling</w:t>
+        <w:t>5.7 Head handling</w:t>
       </w:r>
     </w:p>
     <w:p>
@@ -4365,7 +5391,7 @@
           <w:i w:val="0"/>
           <w:sz w:val="22"/>
         </w:rPr>
-        <w:t>Without counterbalance, lifting a 5 t head at SF 1.5 from 6 bar air needs a 417 mm cylinder and a 10 t head 589 mm, beyond the largest standard bore. The minimum counterbalance fraction that keeps a single cylinder within 320 mm is 41% for 5 t, 70% for 10 t, 80% for 15 t and 85% for 20 t (Fig. 7). A pneumatic manipulator is therefore feasible only as a counterbalanced device in which air supplies the balance correction and motion, not the lift, consistent with passive gravity compensation [21]. Compressibility also makes a pneumatic axis compliant, so the final seating of the head must rely on mechanical guides and alignment pins, and holding must rely on a spring-applied mechanical lock rather than on air pressure.</w:t>
+        <w:t>Without counterbalance, lifting a 5 t head at SF 1.5 from 6 bar air needs a 417 mm cylinder and a 10 t head 589 mm, beyond the largest standard bore. The minimum counterbalance fraction that keeps a single cylinder within 320 mm is 41% for 5 t, 70% for 10 t, 80% for 15 t and 85% for 20 t (Fig. 8). A pneumatic manipulator is therefore feasible only as a counterbalanced device in which air supplies the balance correction and motion, not the lift, consistent with passive gravity compensation [21]. Compressibility also makes a pneumatic axis compliant, so the final seating of the head must rely on mechanical guides and alignment pins, and holding must rely on a spring-applied mechanical lock rather than on air pressure.</w:t>
       </w:r>
     </w:p>
     <w:p>
@@ -4376,7 +5402,7 @@
         <w:drawing>
           <wp:inline xmlns:a="http://schemas.openxmlformats.org/drawingml/2006/main" xmlns:pic="http://schemas.openxmlformats.org/drawingml/2006/picture">
             <wp:extent cx="4754880" cy="3067013"/>
-            <wp:docPr id="7" name="Picture 7"/>
+            <wp:docPr id="8" name="Picture 8"/>
             <wp:cNvGraphicFramePr>
               <a:graphicFrameLocks noChangeAspect="1"/>
             </wp:cNvGraphicFramePr>
@@ -4384,11 +5410,11 @@
               <a:graphicData uri="http://schemas.openxmlformats.org/drawingml/2006/picture">
                 <pic:pic>
                   <pic:nvPicPr>
-                    <pic:cNvPr id="0" name="figure7_manipulator.png"/>
+                    <pic:cNvPr id="0" name="figure8_manipulator.png"/>
                     <pic:cNvPicPr/>
                   </pic:nvPicPr>
                   <pic:blipFill>
-                    <a:blip r:embed="rId15"/>
+                    <a:blip r:embed="rId16"/>
                     <a:stretch>
                       <a:fillRect/>
                     </a:stretch>
@@ -4415,7 +5441,7 @@
         <w:rPr>
           <w:sz w:val="19"/>
         </w:rPr>
-        <w:t>Fig. 7 Single-cylinder bore needed to lift a head against its unbalanced weight, as a function of head mass and counterbalance fraction. Head mass was not available and is swept.</w:t>
+        <w:t>Fig. 8 Single-cylinder bore needed to lift a head against its unbalanced weight, as a function of head mass and counterbalance fraction. Head mass was not available and is swept.</w:t>
       </w:r>
     </w:p>
     <w:p>
@@ -4427,7 +5453,7 @@
           <w:b/>
           <w:sz w:val="22"/>
         </w:rPr>
-        <w:t>5.7 Control logic</w:t>
+        <w:t>5.8 Control logic</w:t>
       </w:r>
     </w:p>
     <w:p>
@@ -4440,7 +5466,7 @@
           <w:i w:val="0"/>
           <w:sz w:val="22"/>
         </w:rPr>
-        <w:t>With the full interlock set and the resume rule, exhaustive exploration finds no safety violation: 715 reachable states and 366080 checked transitions for a 12-bolt flange (347 and 177664 for 4 bolts), with all 13 modes reachable and no deadlocked state. Every mutant is detected (Table 5), so each invariant is capable of failing. The liveness check, however, found a defect in the logic as first specified. Without an explicit rule for resuming an interrupted phase, 1232 of 2105 reachable states for a 12-bolt flange (144 of 385 for 4 bolts) can never reach OPEN or CLOSED: an emergency stop part-way through unbolting or tightening leaves a partially bolted joint from which the prose interlocks provide no way forward, so the operator would have to leave the automated system. Adding the rule that atmosphere confirmation routes to the interrupted phase — continue unbolting, resume tightening at the next unverified bolt, repeat the leak test or await sign-off — removes every deadlock while preserving all seven invariants.</w:t>
+        <w:t>With the full interlock set and the resume rule, exhaustive exploration finds no safety violation: 715 reachable states and 366080 checked transitions for a 12-bolt flange (347 and 177664 for 4 bolts), with all 13 modes reachable and no deadlocked state. Every mutant is detected (Table 6), so each invariant is capable of failing. The liveness check, however, found a defect in the logic as first specified. Without an explicit rule for resuming an interrupted phase, 1232 of 2105 reachable states for a 12-bolt flange (144 of 385 for 4 bolts) can never reach OPEN or CLOSED: an emergency stop part-way through unbolting or tightening leaves a partially bolted joint from which the prose interlocks provide no way forward, so the operator would have to leave the automated system. Adding the rule that atmosphere confirmation routes to the interrupted phase — continue unbolting, resume tightening at the next unverified bolt, repeat the leak test or await sign-off — removes every deadlock while preserving all seven invariants.</w:t>
       </w:r>
     </w:p>
     <w:tbl>
@@ -4890,7 +5916,7 @@
         <w:rPr>
           <w:sz w:val="19"/>
         </w:rPr>
-        <w:t>Table 5. Mutation test of the interlock logic (4-bolt flange). Each interlock removed in isolation is caught by the invariant it protects.</w:t>
+        <w:t>Table 6. Mutation test of the interlock logic (4-bolt flange). Each interlock removed in isolation is caught by the invariant it protects.</w:t>
       </w:r>
     </w:p>
     <w:p>
@@ -4902,7 +5928,7 @@
           <w:b/>
           <w:sz w:val="22"/>
         </w:rPr>
-        <w:t>5.8 Failure modes</w:t>
+        <w:t>5.9 Failure modes</w:t>
       </w:r>
     </w:p>
     <w:p>
@@ -4915,7 +5941,7 @@
           <w:i w:val="0"/>
           <w:sz w:val="22"/>
         </w:rPr>
-        <w:t>The highest-ranked failure mode (Fig. 8, Table 6) is an out-of-window preload that goes undetected (RPN 160), which follows directly from Section 5.5: torque control alone cannot see a nut-factor outlier, and detection depends on the angle channel. Second is failure of gas detection to register residual hydrocarbons (RPN 150, severity 10), which is why the design specifies voted redundant detectors and a pre-cycle functional test. The failure modes with the highest severity but lower RPN — head release with a bolt engaged and loss of air under load — are those the interlocks and the mechanical lock address by design; their low RPN reflects the control, not the absence of the hazard.</w:t>
+        <w:t>The highest-ranked failure mode (Fig. 9, Table 7) is an out-of-window preload that goes undetected (RPN 160), which follows directly from Section 5.6: torque control alone cannot see a nut-factor outlier, and detection depends on the angle channel. Second is failure of gas detection to register residual hydrocarbons (RPN 150, severity 10), which is why the design specifies voted redundant detectors and a pre-cycle functional test. The failure modes with the highest severity but lower RPN — head release with a bolt engaged and loss of air under load — are those the interlocks and the mechanical lock address by design; their low RPN reflects the control, not the absence of the hazard.</w:t>
       </w:r>
     </w:p>
     <w:p>
@@ -4926,7 +5952,7 @@
         <w:drawing>
           <wp:inline xmlns:a="http://schemas.openxmlformats.org/drawingml/2006/main" xmlns:pic="http://schemas.openxmlformats.org/drawingml/2006/picture">
             <wp:extent cx="5760720" cy="2702727"/>
-            <wp:docPr id="8" name="Picture 8"/>
+            <wp:docPr id="9" name="Picture 9"/>
             <wp:cNvGraphicFramePr>
               <a:graphicFrameLocks noChangeAspect="1"/>
             </wp:cNvGraphicFramePr>
@@ -4934,11 +5960,11 @@
               <a:graphicData uri="http://schemas.openxmlformats.org/drawingml/2006/picture">
                 <pic:pic>
                   <pic:nvPicPr>
-                    <pic:cNvPr id="0" name="figure8_fmea.png"/>
+                    <pic:cNvPr id="0" name="figure9_fmea.png"/>
                     <pic:cNvPicPr/>
                   </pic:nvPicPr>
                   <pic:blipFill>
-                    <a:blip r:embed="rId16"/>
+                    <a:blip r:embed="rId17"/>
                     <a:stretch>
                       <a:fillRect/>
                     </a:stretch>
@@ -4965,7 +5991,7 @@
         <w:rPr>
           <w:sz w:val="19"/>
         </w:rPr>
-        <w:t>Fig. 8 Design FMEA ranked by risk priority number; colour indicates severity. Scores are the author's judgement and are listed with their controls in Table 6.</w:t>
+        <w:t>Fig. 9 Design FMEA ranked by risk priority number; colour indicates severity. Scores are the author's judgement and are listed with their controls in Table 7.</w:t>
       </w:r>
     </w:p>
     <w:tbl>
@@ -6572,7 +7598,7 @@
         <w:rPr>
           <w:sz w:val="19"/>
         </w:rPr>
-        <w:t>Table 6. Design FMEA (1–10 scales; D = 10 is undetectable).</w:t>
+        <w:t>Table 7. Design FMEA (1–10 scales; D = 10 is undetectable).</w:t>
       </w:r>
     </w:p>
     <w:p>
@@ -6584,7 +7610,7 @@
           <w:b/>
           <w:sz w:val="22"/>
         </w:rPr>
-        <w:t>5.9 Automation coverage and exposure</w:t>
+        <w:t>5.10 Automation coverage and exposure</w:t>
       </w:r>
     </w:p>
     <w:tbl>
@@ -6981,7 +8007,7 @@
         <w:rPr>
           <w:sz w:val="19"/>
         </w:rPr>
-        <w:t>Table 7. Operations, modelled durations (one-head configuration, medians) and automation levels used in the coverage metric.</w:t>
+        <w:t>Table 8. Operations, modelled durations (one-head configuration, medians) and automation levels used in the coverage metric.</w:t>
       </w:r>
     </w:p>
     <w:p>
@@ -6994,7 +8020,7 @@
           <w:i w:val="0"/>
           <w:sz w:val="22"/>
         </w:rPr>
-        <w:t>Weighted by modelled duration, automation coverage is A = 0.94 (Table 7). The reported manual procedure places four to six workers in the hazard zone for four to six hours, 16–36 person-hours per operation; with the automated system the routine value is zero, rising to at most 0.46 person-hours if gasket cassette loading has to be done at the flange rather than from outside the zone. The exposure reduction is the least uncertain benefit of the architecture: it does not depend on the step times that dominate the cycle-time uncertainty.</w:t>
+        <w:t>Weighted by modelled duration, automation coverage is A = 0.94 (Table 8). The reported manual procedure places four to six workers in the hazard zone for four to six hours, 16–36 person-hours per operation; with the automated system the routine value is zero, rising to at most 0.46 person-hours if gasket cassette loading has to be done at the flange rather than from outside the zone. The exposure reduction is the least uncertain benefit of the architecture: it does not depend on the step times that dominate the cycle-time uncertainty.</w:t>
       </w:r>
     </w:p>
     <w:p>
@@ -7031,7 +8057,7 @@
           <w:i w:val="0"/>
           <w:sz w:val="22"/>
         </w:rPr>
-        <w:t>The analysis supports two of the three original targets and conditions the third. The exposure target is met by design. The torque-accuracy target is achievable but, on its own, does not deliver the preload quality it appears to promise; what delivers it is the angle channel. The cycle-time target is not met by the architecture as first described, with one runner per flange, under any combination of assumed step times; it requires four synchronised heads per flange and a carousel whose throughput scales with them. That is a substantially larger and more expensive machine than the original proposal implied, and it changes the comparison with manual work: a single automated head is slower than a crew of four to six, and the automated system matches or improves on manual duration only when it too works several bolts at once.</w:t>
+        <w:t>The analysis supports two of the three original targets and conditions the third. The exposure target is met by design. The torque-accuracy target is achievable but, on its own, does not deliver the preload quality it appears to promise; what delivers it is the angle channel. The cycle-time target is not met by the architecture as first described, with one runner per flange, under any combination of assumed step times. The 8.0 h single-head result is not a failure of the concept but a finding about it: a single tool is the wrong architecture for a 92-bolt, multi-pass closure. The architecture the analysis supports has four synchronised heads per flange, one bolt-transfer channel per head and, if validated, a two-star-pass procedure, which brings bolting from 8.0 h to 1.6 h. Parallelisation, not faster tools, is what matters: the admissibility analysis shows that no plausible per-bolt time lets one head meet the target, and once torque application is parallelised every stage around it — bolt handling above all — must be parallelised too. This is a substantially larger and more expensive machine than the original proposal implied, and it changes the comparison with manual work: a single automated head is slower than a crew of four to six, and the automated system matches or improves on manual duration only when it too works several bolts at once. The target also has to be read as the source stated it, for bolting: the complete operation remains about 3.4 h, governed by head handling and the leak test, and shortening it is a separate design problem for those subsystems.</w:t>
       </w:r>
     </w:p>
     <w:p>
@@ -7056,7 +8082,7 @@
           <w:i w:val="0"/>
           <w:sz w:val="22"/>
         </w:rPr>
-        <w:t>For a single head the star pattern costs far more travel than a circular pass (Fig. 2b), and circular-only tightening shortens the cycle, but the legacy procedure uses the star pattern for good reason: it limits the load redistribution caused by elastic interaction [2, 3]. Multi-head carriages remove most of the travel penalty while keeping cross-pattern loading, because each station tightens bolts at 90° spacing together. Alternative patterns with fewer passes [7], and sequences optimised using interaction coefficients [9], are the natural next step, since the model shows that each pass removed saves roughly a quarter of the closing time with four heads.</w:t>
+        <w:t>For a single head the star pattern costs far more travel than a circular pass (Fig. 2b), and circular-only tightening shortens the cycle, but the legacy procedure uses the star pattern for good reason: it limits the load redistribution caused by elastic interaction [2, 3]. Section 5.5 shows that optimising the order of the tool path under a load-spreading constraint recovers only a few per cent of the travel, because the opposite-bolt rule fixes most of it. Multi-head carriages remove the penalty while keeping cross-pattern loading, because each station tightens bolts at 90° spacing together. The remaining sequence lever is the number of passes: with four heads and four transfer channels, removing one star pass shortens closing by 17%. Alternative patterns with fewer passes [7] and sequences optimised using measured interaction coefficients [9] are the way to make that saving safely, and the manufacturing question becomes which reduced-pass procedure gives acceptable preload uniformity on this joint.</w:t>
       </w:r>
     </w:p>
     <w:p>
@@ -7131,7 +8157,7 @@
           <w:i w:val="0"/>
           <w:sz w:val="22"/>
         </w:rPr>
-        <w:t>The source proposal described hazardous-area certification of the integrated system as achievable by selecting certified components. Component certification is necessary but not sufficient: the integrated assembly, including carriage drives, transducers, the carousel and the controller, must satisfy the applicable protection concepts as a whole [25–27]. The gas-clearance and head-motion interlocks are safety functions, and their integrity requirements belong to a functional-safety assessment [28]. The exhaustive check in Section 5.7 shows that the logic is consistent and deadlock-free as specified; it does not establish the hardware fault tolerance or safety integrity level of its implementation.</w:t>
+        <w:t>The source proposal described hazardous-area certification of the integrated system as achievable by selecting certified components. Component certification is necessary but not sufficient: the integrated assembly, including carriage drives, transducers, the carousel and the controller, must satisfy the applicable protection concepts as a whole [25–27]. The gas-clearance and head-motion interlocks are safety functions, and their integrity requirements belong to a functional-safety assessment [28]. The exhaustive check in Section 5.8 shows that the logic is consistent and deadlock-free as specified; it does not establish the hardware fault tolerance or safety integrity level of its implementation.</w:t>
       </w:r>
     </w:p>
     <w:p>
@@ -7181,7 +8207,7 @@
           <w:i w:val="0"/>
           <w:sz w:val="22"/>
         </w:rPr>
-        <w:t>The predictions above can be falsified by a staged test programme. Table 8 lists the measurements, the rig on which each is made and the acceptance criterion that would confirm or refute the corresponding result.</w:t>
+        <w:t>The predictions above can be falsified by a staged test programme. Table 9 lists the measurements, the rig on which each is made and the acceptance criterion that would confirm or refute the corresponding result.</w:t>
       </w:r>
     </w:p>
     <w:tbl>
@@ -7424,7 +8450,7 @@
               <w:rPr>
                 <w:sz w:val="17"/>
               </w:rPr>
-              <w:t>Nut-factor scatter CV_K</w:t>
+              <w:t>Bolt transfer with four channels</w:t>
             </w:r>
           </w:p>
         </w:tc>
@@ -7441,7 +8467,7 @@
               <w:rPr>
                 <w:sz w:val="17"/>
               </w:rPr>
-              <w:t>Instrumented studs (ultrasonic elongation) on the mock-up</w:t>
+              <w:t>Carousel with four access stations on the mock-up</w:t>
             </w:r>
           </w:p>
         </w:tc>
@@ -7458,7 +8484,7 @@
               <w:rPr>
                 <w:sz w:val="17"/>
               </w:rPr>
-              <w:t>Measured CV_K; preload prediction of Fig. 6a to be confirmed within ±2 points</w:t>
+              <w:t>Median transfer time within the Table 2 range per channel, with no interference between channels (configuration B)</w:t>
             </w:r>
           </w:p>
         </w:tc>
@@ -7477,6 +8503,112 @@
               <w:rPr>
                 <w:sz w:val="17"/>
               </w:rPr>
+              <w:t>Two-star-pass procedure and optimised tool path</w:t>
+            </w:r>
+          </w:p>
+        </w:tc>
+        <w:tc>
+          <w:tcPr>
+            <w:tcW w:type="dxa" w:w="3168"/>
+          </w:tcPr>
+          <w:p>
+            <w:pPr>
+              <w:spacing w:line="240" w:lineRule="auto" w:after="0"/>
+            </w:pPr>
+            <w:r/>
+            <w:r>
+              <w:rPr>
+                <w:sz w:val="17"/>
+              </w:rPr>
+              <w:t>Full-flange mock-up with instrumented studs and the service gasket</w:t>
+            </w:r>
+          </w:p>
+        </w:tc>
+        <w:tc>
+          <w:tcPr>
+            <w:tcW w:type="dxa" w:w="3312"/>
+          </w:tcPr>
+          <w:p>
+            <w:pPr>
+              <w:spacing w:line="240" w:lineRule="auto" w:after="0"/>
+            </w:pPr>
+            <w:r/>
+            <w:r>
+              <w:rPr>
+                <w:sz w:val="17"/>
+              </w:rPr>
+              <w:t>Final preload scatter and gasket-stress uniformity no worse than the legacy three-pass procedure; otherwise configuration B, not C–E, is the design</w:t>
+            </w:r>
+          </w:p>
+        </w:tc>
+      </w:tr>
+      <w:tr>
+        <w:tc>
+          <w:tcPr>
+            <w:tcW w:type="dxa" w:w="2592"/>
+          </w:tcPr>
+          <w:p>
+            <w:pPr>
+              <w:spacing w:line="240" w:lineRule="auto" w:after="0"/>
+            </w:pPr>
+            <w:r/>
+            <w:r>
+              <w:rPr>
+                <w:sz w:val="17"/>
+              </w:rPr>
+              <w:t>Nut-factor scatter CV_K</w:t>
+            </w:r>
+          </w:p>
+        </w:tc>
+        <w:tc>
+          <w:tcPr>
+            <w:tcW w:type="dxa" w:w="3168"/>
+          </w:tcPr>
+          <w:p>
+            <w:pPr>
+              <w:spacing w:line="240" w:lineRule="auto" w:after="0"/>
+            </w:pPr>
+            <w:r/>
+            <w:r>
+              <w:rPr>
+                <w:sz w:val="17"/>
+              </w:rPr>
+              <w:t>Instrumented studs (ultrasonic elongation) on the mock-up</w:t>
+            </w:r>
+          </w:p>
+        </w:tc>
+        <w:tc>
+          <w:tcPr>
+            <w:tcW w:type="dxa" w:w="3312"/>
+          </w:tcPr>
+          <w:p>
+            <w:pPr>
+              <w:spacing w:line="240" w:lineRule="auto" w:after="0"/>
+            </w:pPr>
+            <w:r/>
+            <w:r>
+              <w:rPr>
+                <w:sz w:val="17"/>
+              </w:rPr>
+              <w:t>Measured CV_K; preload prediction of Fig. 7a to be confirmed within ±2 points</w:t>
+            </w:r>
+          </w:p>
+        </w:tc>
+      </w:tr>
+      <w:tr>
+        <w:tc>
+          <w:tcPr>
+            <w:tcW w:type="dxa" w:w="2592"/>
+          </w:tcPr>
+          <w:p>
+            <w:pPr>
+              <w:spacing w:line="240" w:lineRule="auto" w:after="0"/>
+            </w:pPr>
+            <w:r/>
+            <w:r>
+              <w:rPr>
+                <w:sz w:val="17"/>
+              </w:rPr>
               <w:t>Angle-estimate uncertainty CV_θ</w:t>
             </w:r>
           </w:p>
@@ -7511,7 +8643,7 @@
               <w:rPr>
                 <w:sz w:val="17"/>
               </w:rPr>
-              <w:t>CV_θ ≤ 5% for the torque–angle benefit of Fig. 6b to hold</w:t>
+              <w:t>CV_θ ≤ 5% for the torque–angle benefit of Fig. 7b to hold</w:t>
             </w:r>
           </w:p>
         </w:tc>
@@ -7684,7 +8816,7 @@
         <w:rPr>
           <w:sz w:val="19"/>
         </w:rPr>
-        <w:t>Table 8. Validation measurements and acceptance criteria. A pilot on one bottom head is proposed only after the single-station and mock-up tests have been passed.</w:t>
+        <w:t>Table 9. Validation measurements and acceptance criteria. A pilot on one bottom head is proposed only after the single-station and mock-up tests have been passed.</w:t>
       </w:r>
     </w:p>
     <w:p>
@@ -7709,7 +8841,7 @@
           <w:i w:val="0"/>
           <w:sz w:val="22"/>
         </w:rPr>
-        <w:t>Each subsystem uses established technology — pneumatic torque multipliers, rails and carriages, fastener magazines, counterbalanced manipulators and programmable controllers — so the development risk lies in integration and in the hazardous-area environment rather than in any single component. The preliminary cost estimates of the source proposal, about US$0.14–0.20 million for a single-flange pilot and US$0.74–1.1 million for all three flanges on four drums, assumed one runner per flange. The results of Section 5 imply a four-head carriage and a faster carousel on each flange if the cycle-time target is to be met, so those estimates are likely to be low and should be revised after the single-station tests. A staged programme — single-station rig, full-flange mock-up, then a pilot on one bottom head — allows the project to stop cheaply if the measured step times, nut-factor scatter or engagement success fall outside the ranges on which the results depend.</w:t>
+        <w:t>Each subsystem uses established technology — pneumatic torque multipliers, rails and carriages, fastener magazines, counterbalanced manipulators and programmable controllers — so the development risk lies in integration and in the hazardous-area environment rather than in any single component. The preliminary cost estimates of the source proposal, about US$0.14–0.20 million for a single-flange pilot and US$0.74–1.1 million for all three flanges on four drums, assumed one runner per flange. The results of Section 5 imply a four-head carriage and four bolt-transfer channels on each flange if the bolting target is to be met, so those estimates are likely to be low and should be revised after the single-station tests; shortening the complete operation further would require faster head handling and leak testing, which were not costed. A staged programme — single-station rig, full-flange mock-up, then a pilot on one bottom head — allows the project to stop cheaply if the measured step times, nut-factor scatter or engagement success fall outside the ranges on which the results depend.</w:t>
       </w:r>
     </w:p>
     <w:p>
@@ -7734,7 +8866,7 @@
           <w:i w:val="0"/>
           <w:sz w:val="22"/>
         </w:rPr>
-        <w:t>An automated architecture for opening and closing a 92-bolt, three-flange pressure vessel was evaluated by simulation against the targets originally claimed for it. With one torque head per flange, bolting takes a median 8.0 h and cannot meet a 2.5 h target under any assumed step times; four synchronised heads per flange bring the median to 2.3 h, and the carousel then becomes the rate-limiting element. Specifying ±2% torque accuracy does little for preload, which nut-factor scatter dominates, whereas torque–angle verification with re-torque substantially narrows it. The interlock logic is safe as specified but deadlocks after an interrupted sequence unless an explicit resume rule is added. Pneumatic head handling requires a counterbalance carrying most of the load. The reduction in hazard-zone exposure, from 16–36 person-hours to essentially none, is the most robust benefit. These are predictions, and the validation plan specifies the measurements that would confirm or overturn them.</w:t>
+        <w:t>An automated architecture for opening and closing a 92-bolt, three-flange pressure vessel was evaluated by simulation against the targets originally claimed for it. With one torque head per flange, bolting takes a median 8.0 h and cannot meet a 2.5 h target under any assumed step times: a single tool is the wrong architecture for this closure. Parallelising in stages brings bolting to 2.3 h with four synchronised heads, 1.8 h with a bolt-transfer channel per head and 1.6 h with one fewer star pass, the last subject to validation of preload uniformity. An exactly optimised tool path and pipelined servicing add little, the first because the opposite-bolt rule fixes most of the travel and the second because the bottom head is on the critical path in every phase. The complete operation remains about 3.4 h, governed by head handling and the leak test, so the 2.5 h target holds for bolting but not for the whole operation. Specifying ±2% torque accuracy does little for preload, which nut-factor scatter dominates, whereas torque–angle verification with re-torque substantially narrows it. The interlock logic is safe as specified but deadlocks after an interrupted sequence unless an explicit resume rule is added. Pneumatic head handling requires a counterbalance carrying most of the load. The reduction in hazard-zone exposure, from 16–36 person-hours to essentially none, is the most robust benefit. These are predictions, and the validation plan specifies the measurements that would confirm or overturn them.</w:t>
       </w:r>
     </w:p>
     <w:p>

</xml_diff>

<commit_message>
Robustness to input distributions, feasibility map, servicing envelope; recommend 4 heads + 4 channels
- Triangular and correlated (Gaussian copula, rho 0.6) input models: architecture ranking
  holds in every sample; B meets 2.5 h in 98 / 99.7 / 92 % of samples
- Design feasibility map over heads x transfer channels x passes (new Fig. 7)
- Servicing-time envelope for a 2.5 h complete operation (Eq. 14)
- Recommended design is the machine-only configuration B; reduced passes optional
- 'Cannot reach 2.5 h' qualified to the investigated parameter bounds; torque-angle
  result qualified by its assumed 3 % angle-estimate uncertainty; Spearman stated as a
  screening measure; cost-scaling structure without invented prices; Section 7 renamed
  Experimental validation and falsification plan

Co-Authored-By: Claude Opus 5.5 <noreply@anthropic.com>
</commit_message>
<xml_diff>
--- a/manuscript/PABHS_IJAMT_Manuscript.docx
+++ b/manuscript/PABHS_IJAMT_Manuscript.docx
@@ -71,7 +71,7 @@
           <w:i w:val="0"/>
           <w:sz w:val="22"/>
         </w:rPr>
-        <w:t>Large bolted closures on process vessels are still assembled largely by hand, often in hazardous areas, using multi-pass tightening sequences whose duration and preload outcome are rarely quantified. This paper evaluates by simulation an automated architecture for such closures: orbital pneumatic torque runners on the flange, a bolt-management carousel, a counterbalanced head manipulator and an interlocking sequence controller, applied to a 92-bolt, three-flange delayed-coking drum. A Monte Carlo cycle-time model built on the actual star-pattern rail travel shows that one torque head per flange needs a median 8.0 h to unbolt and re-bolt the drum and cannot reach a 2.5 h target under any assumed step times. Removing bottlenecks in turn gives 2.3 h with four synchronised heads, 1.8 h with a bolt-transfer channel per head and 1.6 h with one fewer star pass; an exactly optimised tool path adds little, because the travel is fixed by the opposite-bolt rule. The complete operation, including head handling, gasket work and leak testing, remains 3.4 h. Specifying ±2% torque accuracy barely affects preload scatter, which nut-factor variation dominates; a torque–angle check with re-torque cuts the share of bolts outside ±10% of target from 32% to 5%. Exhaustive verification of the interlock logic finds no safety violation, but the interlocks as first specified deadlock after a mid-sequence emergency stop; a resume rule removes every deadlock. Pneumatic head handling needs a counterbalance carrying most of the load. All results are predictions; a validation programme with acceptance criteria is given.</w:t>
+        <w:t>Large bolted closures on process vessels are still assembled largely by hand, often in hazardous areas, using multi-pass tightening sequences whose duration and preload outcome are rarely quantified. This paper evaluates by simulation an automated architecture for such closures: orbital pneumatic torque runners on the flange, a bolt-management carousel, a counterbalanced head manipulator and an interlocking sequence controller, applied to a 92-bolt, three-flange delayed-coking drum. A Monte Carlo model built on the actual star-pattern tool travel shows that one torque head per flange needs a median 8.0 h to unbolt and re-bolt the drum and, within the investigated parameter bounds, cannot meet a 2.5 h target. Removing bottlenecks in turn gives 2.3 h with four synchronised heads and 1.8 h with a bolt-transfer channel per head, the recommended machine-only configuration, which meets 2.5 h in 98% of samples; one fewer star pass would give 1.6 h but requires qualification. This ranking holds in every sample under uniform, triangular and correlated input models. An exactly optimised tool path adds little, and the complete operation remains about 3.4 h, governed by head handling and leak testing. Specifying ±2% torque accuracy barely affects preload scatter; under an assumed 3% angle-based preload-estimate uncertainty, torque–angle re-torque cuts bolts outside ±10% of target from 32% to 5%. Exhaustive verification found no safety violation but exposed deadlocks after interrupted sequences, which a resume rule removed. All results are predictions; an experimental falsification plan is given.</w:t>
       </w:r>
     </w:p>
     <w:p>
@@ -147,7 +147,7 @@
           <w:i w:val="0"/>
           <w:sz w:val="22"/>
         </w:rPr>
-        <w:t>The contributions are: (i) a cycle-time model for automated multi-pass flange bolting that computes carriage travel from the actual tightening sequence and propagates step-time uncertainty by Monte Carlo simulation, with a rank-correlation sensitivity analysis; (ii) an admissibility analysis giving the per-bolt-pass time budget implied by a cycle-time target; (iii) a throughput-optimisation study that removes the architecture's bottlenecks one at a time — torque heads, bolt-transfer channels, tightening passes, an exactly optimised tool path under a load-spreading constraint, and pipelined servicing — and reports bolting and complete-operation times separately; (iv) a preload analysis separating the contributions of tool accuracy, nut-factor scatter and torque–angle verification; (v) exhaustive verification of the sequence and interlock logic, including mutation tests and a liveness check that exposes a deadlock in the logic as first specified; and (vi) a force budget for pneumatic head handling, a scored design FMEA and a hazard-exposure comparison. All models are released as open code, and the paper ends with a validation plan whose acceptance criteria can falsify its predictions.</w:t>
+        <w:t>The contributions are: (i) a cycle-time model for automated multi-pass flange bolting that computes carriage travel from the actual tightening sequence and propagates step-time uncertainty by Monte Carlo simulation, with a rank-correlation sensitivity analysis; (ii) an admissibility analysis giving the per-bolt-pass time budget implied by a cycle-time target; (iii) a throughput-optimisation study that removes the architecture's bottlenecks one at a time — torque heads, bolt-transfer channels, tightening passes, an exactly optimised tool path under a load-spreading constraint, and pipelined servicing — and reports bolting and complete-operation times separately, with a robustness check against the assumed input distributions, a design feasibility map and a servicing-time envelope for the complete operation; (iv) a preload analysis separating the contributions of tool accuracy, nut-factor scatter and torque–angle verification; (v) exhaustive verification of the sequence and interlock logic, including mutation tests and a liveness check that exposes a deadlock in the logic as first specified; and (vi) a force budget for pneumatic head handling, a scored design FMEA and a hazard-exposure comparison. All models are released as open code, and the paper ends with a validation plan whose acceptance criteria can falsify its predictions.</w:t>
       </w:r>
     </w:p>
     <w:p>
@@ -2599,7 +2599,7 @@
           <w:i w:val="0"/>
           <w:sz w:val="22"/>
         </w:rPr>
-        <w:t>All inputs in Table 2, the spacing factor k and the position of each bolt size within its range are sampled independently 20000 times with a fixed seed (20260925). Six configurations are compared: one head with flanges in parallel, in series, and with circular passes only; two heads; four heads; and four heads with two instead of three star passes, as an example of a reduced-pass procedure of the kind permitted as an alternative to the legacy sequence [7]. Sensitivity is measured by the Spearman rank correlation between each sampled input and the total bolting time. A best case, with every step at the fast end of its range, bounds what each configuration could achieve. A second study then removes the bottlenecks of the four-head design one at a time, on the same samples: (A) four heads and a single carousel; (B) one transfer channel per head; (C) two star passes; (D) the optimised tool path; (E) pipelined servicing. Discrete-event simulation of this kind is standard for evaluating manufacturing designs before they are built [31].</w:t>
+        <w:t>All inputs in Table 2, the spacing factor k and the position of each bolt size within its range are sampled independently 20000 times with a fixed seed (20260925). Six configurations are compared: one head with flanges in parallel, in series, and with circular passes only; two heads; four heads; and four heads with two instead of three star passes, as an example of a reduced-pass procedure of the kind permitted as an alternative to the legacy sequence [7]. Sensitivity is measured by the Spearman rank correlation between each sampled input and the total bolting time. A best case, with every step at the fast end of its range, bounds what each configuration could achieve. A second study then removes the bottlenecks of the four-head design one at a time, on the same samples: (A) four heads and a single carousel; (B) one transfer channel per head; (C) two star passes; (D) the optimised tool path; (E) pipelined servicing. Three uncertainty models are compared to test whether the conclusions depend on the distributional assumptions (Section 5.6). Spearman rank correlation is used as a computationally transparent screening measure of sensitivity; variance-based (Sobol) analysis is deferred until empirical parameter distributions are available from the validation programme, since apportioning variance among assumed distributions would add precision without adding information. Discrete-event simulation of this kind is standard for evaluating manufacturing designs before they are built [31].</w:t>
       </w:r>
     </w:p>
     <w:p>
@@ -4330,7 +4330,7 @@
           <w:i w:val="0"/>
           <w:sz w:val="22"/>
         </w:rPr>
-        <w:t>With one head per flange and the flanges worked in parallel, bolting takes 7.96 h (90% interval 6.09–10.51 h), set by the bottom head. Working the flanges in series nearly doubles this to 14.5 h, and using only circular passes, which would not satisfy the legacy procedure, still leaves 6.3 h. Most importantly, the single-head configuration cannot meet the 2.5 h target even in its best case of 2.96 h. A second head per flange halves the time to 4.0 h. Only four synchronised heads bring the median within the target, at 2.28 h (90% interval 1.74–2.90 h), and even then the target is met in 73% of samples; four heads with one fewer star pass raise this to 90%. Including head handling, gasket work and the leak test, the full opening and closing operation takes 9.8 h with one head and 4.1 h with four.</w:t>
+        <w:t>With one head per flange and the flanges worked in parallel, bolting takes 7.96 h (90% interval 6.09–10.51 h), set by the bottom head. Working the flanges in series nearly doubles this to 14.5 h, and using only circular passes, which would not satisfy the legacy procedure, still leaves 6.3 h. Most importantly, within the investigated parameter bounds the single-head configuration cannot meet the 2.5 h target even in its best case of 2.96 h. A second head per flange halves the time to 4.0 h. Only four synchronised heads bring the median within the target, at 2.28 h (90% interval 1.74–2.90 h), and even then the target is met in 73% of samples; four heads with one fewer star pass raise this to 90%. Including head handling, gasket work and the leak test, the full opening and closing operation takes 9.8 h with one head and 4.1 h with four.</w:t>
       </w:r>
     </w:p>
     <w:p>
@@ -5215,7 +5215,7 @@
           <w:i w:val="0"/>
           <w:sz w:val="22"/>
         </w:rPr>
-        <w:t>Table 5 and Fig. 6 remove the bottlenecks in turn. Giving each of the four heads its own bolt-transfer channel, for example a carousel with four access stations, cuts bolting from 2.28 to 1.82 h and raises the probability of meeting 2.5 h from 0.73 to 0.98. Removing one star pass brings bolting to 1.60 h, inside the target in every sample; this is a change to the joint-assembly procedure, not to the machine, and is admissible only if a reduced-pass procedure of the kind described as an alternative to the legacy sequence [7] is shown to give equivalent preload uniformity on the actual joint (Section 7). With these two changes the parallelisation is complete: the torque heads, the bolt handling and the passes all scale together.</w:t>
+        <w:t>Table 5 and Fig. 6 remove the bottlenecks in turn. Giving each of the four heads its own bolt-transfer channel, for example a carousel with four access stations, cuts bolting from 2.28 to 1.82 h and raises the probability of meeting 2.5 h from 0.73 to 0.98. This is a change to the machine alone, with the legacy tightening procedure unaltered, and it is the configuration the analysis recommends: four heads and four transfer channels meet the bolting target without any change to how the joint is assembled. Removing one star pass brings bolting further to 1.60 h, inside the target in every sample, but this is a change to the joint-assembly procedure rather than to the machine. It is an optional process improvement, admissible only if a reduced-pass procedure of the kind described as an alternative to the legacy sequence [7] is shown to give equivalent preload uniformity on the actual joint (Section 7); the architecture does not depend on it.</w:t>
       </w:r>
     </w:p>
     <w:p>
@@ -5228,7 +5228,7 @@
           <w:i w:val="0"/>
           <w:sz w:val="22"/>
         </w:rPr>
-        <w:t>The exactly optimised tool path adds little. With four heads it cuts carriage travel per star pass on the bottom head from 2.68 to 1.51 bolt-circle diameters, but travel is by then a small part of the cycle and bolting falls only from 1.60 to 1.57 h. With one head, where travel matters, the optimum reduces travel per star pass only from 56.5 to 55.0 diameters and bolting from 7.96 to 7.91 h. The reason is structural: most of the single-head travel is incurred within each quartet, because opposite bolts, half a turn apart, must be loaded consecutively, and no ordering of the quartets can remove that. The wasted motion of Fig. 2 is thus a consequence of serving a symmetric loading rule with one tool, and the remedy is more tools rather than a better path. Pipelining the servicing steps changes nothing (3.43 h in both D and E) because the bottom head, with the most bolts and a head to handle, is on the critical path in every phase, so the other flanges' chains finish within it.</w:t>
+        <w:t>The exactly optimised tool path adds little, and it is reported for what it shows rather than as part of the recommended design. With four heads it cuts carriage travel per star pass on the bottom head from 2.68 to 1.51 bolt-circle diameters, but travel is by then a small part of the cycle and bolting falls only from 1.60 to 1.57 h. With one head, where travel matters, the optimum reduces travel per star pass only from 56.5 to 55.0 diameters and bolting from 7.96 to 7.91 h. The reason is structural: most of the single-head travel is incurred within each quartet, because opposite bolts, half a turn apart, must be loaded consecutively, and no ordering of the quartets can remove that. The wasted motion of Fig. 2 is thus a consequence of serving a symmetric loading rule with one tool, and the remedy is more tools rather than a better path. Pipelining the servicing steps changes nothing (3.43 h in both D and E) because the bottom head, with the most bolts and a head to handle, is on the critical path in every phase, so the other flanges' chains finish within it.</w:t>
       </w:r>
     </w:p>
     <w:p>
@@ -5241,7 +5241,49 @@
           <w:i w:val="0"/>
           <w:sz w:val="22"/>
         </w:rPr>
-        <w:t>The complete operation is a different matter. Even in configuration E it takes 3.43 h (90% interval 2.88–4.04 h) and meets 2.5 h in none of the 20000 samples. Of the median, 1.57 h is bolting and 1.85 h is servicing: head handling in both directions (0.75 h), the leak test (0.54 h), gasket and face work (0.46 h) and atmosphere confirmation (0.10 h). For the complete operation to fit in 2.5 h with bolting at 1.57 h, the servicing steps would have to total 0.93 h, less than their 1.12 h minimum within the assumed ranges. The 2.5 h target is therefore achievable for bolting, which is what the source proposal stated, but not for the complete operation; once bolting is parallelised, head handling and the leak test become the next bottlenecks.</w:t>
+        <w:t>The complete operation is a different matter. Even in configuration E it takes 3.43 h (90% interval 2.88–4.04 h) and meets 2.5 h in none of the 20000 samples. Of the median, 1.57 h is bolting and 1.85 h is servicing: head handling in both directions (0.75 h), the leak test (0.54 h), gasket and face work (0.46 h) and atmosphere confirmation (0.10 h). The 2.5 h target is therefore achievable for bolting, which is what the source proposal stated, but not for the complete operation; once bolting is parallelised, head handling and the leak test become the next bottlenecks.</w:t>
+      </w:r>
+    </w:p>
+    <w:p>
+      <w:pPr>
+        <w:spacing w:line="360" w:lineRule="auto"/>
+        <w:ind w:firstLine="432"/>
+      </w:pPr>
+      <w:r>
+        <w:rPr>
+          <w:i w:val="0"/>
+          <w:sz w:val="22"/>
+        </w:rPr>
+        <w:t>That observation can be turned into a performance requirement for the servicing subsystems. For a complete operation of at most 2.5 h, the servicing steps must satisfy</w:t>
+      </w:r>
+    </w:p>
+    <w:p>
+      <w:pPr>
+        <w:spacing w:line="288" w:lineRule="auto"/>
+        <w:ind w:left="864"/>
+      </w:pPr>
+      <w:r>
+        <w:rPr>
+          <w:i/>
+        </w:rPr>
+        <w:t>t_atmos + 2t_head + t_gasket + t_leak ≤ 2.5 h − T_bolting</w:t>
+      </w:r>
+      <w:r>
+        <w:tab/>
+        <w:tab/>
+        <w:t>(14)</w:t>
+      </w:r>
+    </w:p>
+    <w:p>
+      <w:pPr>
+        <w:spacing w:line="360" w:lineRule="auto"/>
+      </w:pPr>
+      <w:r>
+        <w:rPr>
+          <w:i w:val="0"/>
+          <w:sz w:val="22"/>
+        </w:rPr>
+        <w:t>With the recommended configuration B (median bolting 1.82 h) the servicing budget is 0.68 h, or 41 min; with the optional reduced-pass configuration C (1.60 h) it is 0.90 h, or 54 min. The assumed servicing ranges give 1.85 h at the median and 1.12 h at best. With configuration C, a 2.5 h complete operation would need, for example, head handling of about 10 min each way, gasket and face work of about 10 min, a leak test of about 15 min and atmosphere confirmation under 5 min, about 50 min in all; with B the same steps would have to fit in about 40 min. Either is roughly a halving of every servicing step. Equation (14) is the envelope any faster head-handling or leak-test design would have to meet; no such design is evaluated here.</w:t>
       </w:r>
     </w:p>
     <w:p>
@@ -5303,7 +5345,525 @@
           <w:b/>
           <w:sz w:val="22"/>
         </w:rPr>
-        <w:t>5.6 Preload</w:t>
+        <w:t>5.6 Robustness to the uncertainty model</w:t>
+      </w:r>
+    </w:p>
+    <w:tbl>
+      <w:tblPr>
+        <w:tblStyle w:val="TableGrid"/>
+        <w:tblW w:type="auto" w:w="0"/>
+        <w:tblLook w:firstColumn="1" w:firstRow="1" w:lastColumn="0" w:lastRow="0" w:noHBand="0" w:noVBand="1" w:val="04A0"/>
+      </w:tblPr>
+      <w:tblGrid>
+        <w:gridCol w:w="2340"/>
+        <w:gridCol w:w="2340"/>
+        <w:gridCol w:w="2340"/>
+        <w:gridCol w:w="2340"/>
+      </w:tblGrid>
+      <w:tr>
+        <w:tc>
+          <w:tcPr>
+            <w:tcW w:type="dxa" w:w="2304"/>
+          </w:tcPr>
+          <w:p>
+            <w:pPr>
+              <w:spacing w:line="240" w:lineRule="auto"/>
+            </w:pPr>
+            <w:r/>
+            <w:r>
+              <w:rPr>
+                <w:b/>
+                <w:sz w:val="17"/>
+              </w:rPr>
+              <w:t>Configuration</w:t>
+            </w:r>
+          </w:p>
+        </w:tc>
+        <w:tc>
+          <w:tcPr>
+            <w:tcW w:type="dxa" w:w="2304"/>
+          </w:tcPr>
+          <w:p>
+            <w:pPr>
+              <w:spacing w:line="240" w:lineRule="auto"/>
+            </w:pPr>
+            <w:r/>
+            <w:r>
+              <w:rPr>
+                <w:b/>
+                <w:sz w:val="17"/>
+              </w:rPr>
+              <w:t>uniform, independent: median (h) / P(≤ 2.5 h)</w:t>
+            </w:r>
+          </w:p>
+        </w:tc>
+        <w:tc>
+          <w:tcPr>
+            <w:tcW w:type="dxa" w:w="2304"/>
+          </w:tcPr>
+          <w:p>
+            <w:pPr>
+              <w:spacing w:line="240" w:lineRule="auto"/>
+            </w:pPr>
+            <w:r/>
+            <w:r>
+              <w:rPr>
+                <w:b/>
+                <w:sz w:val="17"/>
+              </w:rPr>
+              <w:t>triangular, independent: median (h) / P(≤ 2.5 h)</w:t>
+            </w:r>
+          </w:p>
+        </w:tc>
+        <w:tc>
+          <w:tcPr>
+            <w:tcW w:type="dxa" w:w="2304"/>
+          </w:tcPr>
+          <w:p>
+            <w:pPr>
+              <w:spacing w:line="240" w:lineRule="auto"/>
+            </w:pPr>
+            <w:r/>
+            <w:r>
+              <w:rPr>
+                <w:b/>
+                <w:sz w:val="17"/>
+              </w:rPr>
+              <w:t>uniform, correlated (rho = 0.6): median (h) / P(≤ 2.5 h)</w:t>
+            </w:r>
+          </w:p>
+        </w:tc>
+      </w:tr>
+      <w:tr>
+        <w:tc>
+          <w:tcPr>
+            <w:tcW w:type="dxa" w:w="2304"/>
+          </w:tcPr>
+          <w:p>
+            <w:pPr>
+              <w:spacing w:line="240" w:lineRule="auto" w:after="0"/>
+            </w:pPr>
+            <w:r/>
+            <w:r>
+              <w:rPr>
+                <w:sz w:val="17"/>
+              </w:rPr>
+              <w:t>1 head</w:t>
+            </w:r>
+          </w:p>
+        </w:tc>
+        <w:tc>
+          <w:tcPr>
+            <w:tcW w:type="dxa" w:w="2304"/>
+          </w:tcPr>
+          <w:p>
+            <w:pPr>
+              <w:spacing w:line="240" w:lineRule="auto" w:after="0"/>
+            </w:pPr>
+            <w:r/>
+            <w:r>
+              <w:rPr>
+                <w:sz w:val="17"/>
+              </w:rPr>
+              <w:t>7.96 / 0.00</w:t>
+            </w:r>
+          </w:p>
+        </w:tc>
+        <w:tc>
+          <w:tcPr>
+            <w:tcW w:type="dxa" w:w="2304"/>
+          </w:tcPr>
+          <w:p>
+            <w:pPr>
+              <w:spacing w:line="240" w:lineRule="auto" w:after="0"/>
+            </w:pPr>
+            <w:r/>
+            <w:r>
+              <w:rPr>
+                <w:sz w:val="17"/>
+              </w:rPr>
+              <w:t>7.86 / 0.00</w:t>
+            </w:r>
+          </w:p>
+        </w:tc>
+        <w:tc>
+          <w:tcPr>
+            <w:tcW w:type="dxa" w:w="2304"/>
+          </w:tcPr>
+          <w:p>
+            <w:pPr>
+              <w:spacing w:line="240" w:lineRule="auto" w:after="0"/>
+            </w:pPr>
+            <w:r/>
+            <w:r>
+              <w:rPr>
+                <w:sz w:val="17"/>
+              </w:rPr>
+              <w:t>7.94 / 0.00</w:t>
+            </w:r>
+          </w:p>
+        </w:tc>
+      </w:tr>
+      <w:tr>
+        <w:tc>
+          <w:tcPr>
+            <w:tcW w:type="dxa" w:w="2304"/>
+          </w:tcPr>
+          <w:p>
+            <w:pPr>
+              <w:spacing w:line="240" w:lineRule="auto" w:after="0"/>
+            </w:pPr>
+            <w:r/>
+            <w:r>
+              <w:rPr>
+                <w:sz w:val="17"/>
+              </w:rPr>
+              <w:t>2 heads</w:t>
+            </w:r>
+          </w:p>
+        </w:tc>
+        <w:tc>
+          <w:tcPr>
+            <w:tcW w:type="dxa" w:w="2304"/>
+          </w:tcPr>
+          <w:p>
+            <w:pPr>
+              <w:spacing w:line="240" w:lineRule="auto" w:after="0"/>
+            </w:pPr>
+            <w:r/>
+            <w:r>
+              <w:rPr>
+                <w:sz w:val="17"/>
+              </w:rPr>
+              <w:t>3.99 / 0.00</w:t>
+            </w:r>
+          </w:p>
+        </w:tc>
+        <w:tc>
+          <w:tcPr>
+            <w:tcW w:type="dxa" w:w="2304"/>
+          </w:tcPr>
+          <w:p>
+            <w:pPr>
+              <w:spacing w:line="240" w:lineRule="auto" w:after="0"/>
+            </w:pPr>
+            <w:r/>
+            <w:r>
+              <w:rPr>
+                <w:sz w:val="17"/>
+              </w:rPr>
+              <w:t>3.96 / 0.00</w:t>
+            </w:r>
+          </w:p>
+        </w:tc>
+        <w:tc>
+          <w:tcPr>
+            <w:tcW w:type="dxa" w:w="2304"/>
+          </w:tcPr>
+          <w:p>
+            <w:pPr>
+              <w:spacing w:line="240" w:lineRule="auto" w:after="0"/>
+            </w:pPr>
+            <w:r/>
+            <w:r>
+              <w:rPr>
+                <w:sz w:val="17"/>
+              </w:rPr>
+              <w:t>3.98 / 0.01</w:t>
+            </w:r>
+          </w:p>
+        </w:tc>
+      </w:tr>
+      <w:tr>
+        <w:tc>
+          <w:tcPr>
+            <w:tcW w:type="dxa" w:w="2304"/>
+          </w:tcPr>
+          <w:p>
+            <w:pPr>
+              <w:spacing w:line="240" w:lineRule="auto" w:after="0"/>
+            </w:pPr>
+            <w:r/>
+            <w:r>
+              <w:rPr>
+                <w:sz w:val="17"/>
+              </w:rPr>
+              <w:t>A 4 heads</w:t>
+            </w:r>
+          </w:p>
+        </w:tc>
+        <w:tc>
+          <w:tcPr>
+            <w:tcW w:type="dxa" w:w="2304"/>
+          </w:tcPr>
+          <w:p>
+            <w:pPr>
+              <w:spacing w:line="240" w:lineRule="auto" w:after="0"/>
+            </w:pPr>
+            <w:r/>
+            <w:r>
+              <w:rPr>
+                <w:sz w:val="17"/>
+              </w:rPr>
+              <w:t>2.28 / 0.73</w:t>
+            </w:r>
+          </w:p>
+        </w:tc>
+        <w:tc>
+          <w:tcPr>
+            <w:tcW w:type="dxa" w:w="2304"/>
+          </w:tcPr>
+          <w:p>
+            <w:pPr>
+              <w:spacing w:line="240" w:lineRule="auto" w:after="0"/>
+            </w:pPr>
+            <w:r/>
+            <w:r>
+              <w:rPr>
+                <w:sz w:val="17"/>
+              </w:rPr>
+              <w:t>2.28 / 0.80</w:t>
+            </w:r>
+          </w:p>
+        </w:tc>
+        <w:tc>
+          <w:tcPr>
+            <w:tcW w:type="dxa" w:w="2304"/>
+          </w:tcPr>
+          <w:p>
+            <w:pPr>
+              <w:spacing w:line="240" w:lineRule="auto" w:after="0"/>
+            </w:pPr>
+            <w:r/>
+            <w:r>
+              <w:rPr>
+                <w:sz w:val="17"/>
+              </w:rPr>
+              <w:t>2.27 / 0.68</w:t>
+            </w:r>
+          </w:p>
+        </w:tc>
+      </w:tr>
+      <w:tr>
+        <w:tc>
+          <w:tcPr>
+            <w:tcW w:type="dxa" w:w="2304"/>
+          </w:tcPr>
+          <w:p>
+            <w:pPr>
+              <w:spacing w:line="240" w:lineRule="auto" w:after="0"/>
+            </w:pPr>
+            <w:r/>
+            <w:r>
+              <w:rPr>
+                <w:sz w:val="17"/>
+              </w:rPr>
+              <w:t>B + 4 channels</w:t>
+            </w:r>
+          </w:p>
+        </w:tc>
+        <w:tc>
+          <w:tcPr>
+            <w:tcW w:type="dxa" w:w="2304"/>
+          </w:tcPr>
+          <w:p>
+            <w:pPr>
+              <w:spacing w:line="240" w:lineRule="auto" w:after="0"/>
+            </w:pPr>
+            <w:r/>
+            <w:r>
+              <w:rPr>
+                <w:sz w:val="17"/>
+              </w:rPr>
+              <w:t>1.82 / 0.98</w:t>
+            </w:r>
+          </w:p>
+        </w:tc>
+        <w:tc>
+          <w:tcPr>
+            <w:tcW w:type="dxa" w:w="2304"/>
+          </w:tcPr>
+          <w:p>
+            <w:pPr>
+              <w:spacing w:line="240" w:lineRule="auto" w:after="0"/>
+            </w:pPr>
+            <w:r/>
+            <w:r>
+              <w:rPr>
+                <w:sz w:val="17"/>
+              </w:rPr>
+              <w:t>1.82 / 1.00</w:t>
+            </w:r>
+          </w:p>
+        </w:tc>
+        <w:tc>
+          <w:tcPr>
+            <w:tcW w:type="dxa" w:w="2304"/>
+          </w:tcPr>
+          <w:p>
+            <w:pPr>
+              <w:spacing w:line="240" w:lineRule="auto" w:after="0"/>
+            </w:pPr>
+            <w:r/>
+            <w:r>
+              <w:rPr>
+                <w:sz w:val="17"/>
+              </w:rPr>
+              <w:t>1.82 / 0.92</w:t>
+            </w:r>
+          </w:p>
+        </w:tc>
+      </w:tr>
+      <w:tr>
+        <w:tc>
+          <w:tcPr>
+            <w:tcW w:type="dxa" w:w="2304"/>
+          </w:tcPr>
+          <w:p>
+            <w:pPr>
+              <w:spacing w:line="240" w:lineRule="auto" w:after="0"/>
+            </w:pPr>
+            <w:r/>
+            <w:r>
+              <w:rPr>
+                <w:sz w:val="17"/>
+              </w:rPr>
+              <w:t>C + 2 star passes</w:t>
+            </w:r>
+          </w:p>
+        </w:tc>
+        <w:tc>
+          <w:tcPr>
+            <w:tcW w:type="dxa" w:w="2304"/>
+          </w:tcPr>
+          <w:p>
+            <w:pPr>
+              <w:spacing w:line="240" w:lineRule="auto" w:after="0"/>
+            </w:pPr>
+            <w:r/>
+            <w:r>
+              <w:rPr>
+                <w:sz w:val="17"/>
+              </w:rPr>
+              <w:t>1.60 / 1.00</w:t>
+            </w:r>
+          </w:p>
+        </w:tc>
+        <w:tc>
+          <w:tcPr>
+            <w:tcW w:type="dxa" w:w="2304"/>
+          </w:tcPr>
+          <w:p>
+            <w:pPr>
+              <w:spacing w:line="240" w:lineRule="auto" w:after="0"/>
+            </w:pPr>
+            <w:r/>
+            <w:r>
+              <w:rPr>
+                <w:sz w:val="17"/>
+              </w:rPr>
+              <w:t>1.60 / 1.00</w:t>
+            </w:r>
+          </w:p>
+        </w:tc>
+        <w:tc>
+          <w:tcPr>
+            <w:tcW w:type="dxa" w:w="2304"/>
+          </w:tcPr>
+          <w:p>
+            <w:pPr>
+              <w:spacing w:line="240" w:lineRule="auto" w:after="0"/>
+            </w:pPr>
+            <w:r/>
+            <w:r>
+              <w:rPr>
+                <w:sz w:val="17"/>
+              </w:rPr>
+              <w:t>1.60 / 0.98</w:t>
+            </w:r>
+          </w:p>
+        </w:tc>
+      </w:tr>
+      <w:tr>
+        <w:tc>
+          <w:tcPr>
+            <w:tcW w:type="dxa" w:w="2304"/>
+          </w:tcPr>
+          <w:p>
+            <w:pPr>
+              <w:spacing w:line="240" w:lineRule="auto" w:after="0"/>
+            </w:pPr>
+            <w:r/>
+            <w:r>
+              <w:rPr>
+                <w:sz w:val="17"/>
+              </w:rPr>
+              <w:t>Ranking 1 &gt; 2 &gt; A &gt; B holds in</w:t>
+            </w:r>
+          </w:p>
+        </w:tc>
+        <w:tc>
+          <w:tcPr>
+            <w:tcW w:type="dxa" w:w="2304"/>
+          </w:tcPr>
+          <w:p>
+            <w:pPr>
+              <w:spacing w:line="240" w:lineRule="auto" w:after="0"/>
+            </w:pPr>
+            <w:r/>
+            <w:r>
+              <w:rPr>
+                <w:sz w:val="17"/>
+              </w:rPr>
+              <w:t>100.0% of samples</w:t>
+            </w:r>
+          </w:p>
+        </w:tc>
+        <w:tc>
+          <w:tcPr>
+            <w:tcW w:type="dxa" w:w="2304"/>
+          </w:tcPr>
+          <w:p>
+            <w:pPr>
+              <w:spacing w:line="240" w:lineRule="auto" w:after="0"/>
+            </w:pPr>
+            <w:r/>
+            <w:r>
+              <w:rPr>
+                <w:sz w:val="17"/>
+              </w:rPr>
+              <w:t>100.0% of samples</w:t>
+            </w:r>
+          </w:p>
+        </w:tc>
+        <w:tc>
+          <w:tcPr>
+            <w:tcW w:type="dxa" w:w="2304"/>
+          </w:tcPr>
+          <w:p>
+            <w:pPr>
+              <w:spacing w:line="240" w:lineRule="auto" w:after="0"/>
+            </w:pPr>
+            <w:r/>
+            <w:r>
+              <w:rPr>
+                <w:sz w:val="17"/>
+              </w:rPr>
+              <w:t>100.0% of samples</w:t>
+            </w:r>
+          </w:p>
+        </w:tc>
+      </w:tr>
+    </w:tbl>
+    <w:p>
+      <w:pPr>
+        <w:spacing w:line="240" w:lineRule="auto" w:after="200"/>
+      </w:pPr>
+      <w:r>
+        <w:rPr>
+          <w:sz w:val="19"/>
+        </w:rPr>
+        <w:t>Table 6. Bolting time under three uncertainty models: the baseline independent uniform distributions, independent symmetric triangular distributions with the mode at the midpoint of each range, and uniform margins with a correlation of 0.6, through a Gaussian copula, among alignment, engagement and torque times, retry and review probabilities and bolt size.</w:t>
       </w:r>
     </w:p>
     <w:p>
@@ -5316,17 +5876,30 @@
           <w:i w:val="0"/>
           <w:sz w:val="22"/>
         </w:rPr>
-        <w:t>Fig. 7a shows that the ±2% torque accuracy stated for the system has almost no effect on preload scatter. With CV_K = 10%, preload CV is 10.4% for a ±2% tool, 10.7% for ±5% and 11.8% for ±10%; 32% of bolts fall outside ±10% of target even with the ±2% tool. Preload scatter is set by the nut factor, as the torque–tension literature leads one to expect [10–12]. The angle channel is what changes the outcome (Fig. 7b): with an angle-based preload estimate of 3% uncertainty and re-torque of bolts outside ±10%, the fraction outside falls from 32% to 5% (CV_K = 10%) and from 50% to 5% (CV_K = 15%), at the cost of re-torquing 34% and 51% of bolts respectively. With a 5% angle-estimate uncertainty the residual is about 10%; with 8% the benefit largely disappears. The value of torque–angle monitoring therefore depends on how well joint stiffness is known, which the validation plan measures.</w:t>
+        <w:t>The step-time ranges of Table 2 are assumptions, and so are the uniform distributions and the independence with which they are sampled. A reviewer could reasonably argue that a large, badly aligned bolt takes longer to align, engage and torque and is also likelier to need a retry or review, so that those inputs move together. Table 6 repeats the analysis under two alternatives: triangular distributions centred on the nominal value, and a pessimistic case in which those six inputs are positively correlated. The medians barely move, because the ranges are unchanged; the tails do. In the correlated case the probability that the recommended configuration B meets 2.5 h falls from 0.98 to 0.92 and its 95th percentile rises from 2.37 to 2.60 h, whereas under triangular distributions it rises to 0.997. What does not change is the architectural ranking: one head is slower than two, two slower than four, and four heads with a single carousel slower than four with four transfer channels, in every one of the 20000 samples under all three models. The paper's central claim is that ranking, not the particular value of 1.82 h.</w:t>
       </w:r>
     </w:p>
     <w:p>
       <w:pPr>
+        <w:spacing w:line="360" w:lineRule="auto"/>
+        <w:ind w:firstLine="432"/>
+      </w:pPr>
+      <w:r>
+        <w:rPr>
+          <w:i w:val="0"/>
+          <w:sz w:val="22"/>
+        </w:rPr>
+        <w:t>Fig. 7 generalises the discrete configurations into a design feasibility map over the number of torque heads and transfer channels per flange, for the legacy three-star-pass procedure and a two-pass alternative. Heads are limited to 1, 2 and 4 because they must be equally spaced on all three flanges, and 32, 48 and 12 bolts are all divisible only by those. The feasible region, where bolting meets 2.5 h in at least 90% of samples, requires four heads under either procedure: with four heads, two transfer channels give 0.94 under the legacy procedure, and the two-pass procedure reaches 0.90, just short of the threshold, even with a single channel. With two heads no combination exceeds 0.12. Adding channels without adding heads achieves almost nothing, because transfer is a bottleneck only once torque application has been parallelised.</w:t>
+      </w:r>
+    </w:p>
+    <w:p>
+      <w:pPr>
         <w:jc w:val="center"/>
       </w:pPr>
       <w:r>
         <w:drawing>
           <wp:inline xmlns:a="http://schemas.openxmlformats.org/drawingml/2006/main" xmlns:pic="http://schemas.openxmlformats.org/drawingml/2006/picture">
-            <wp:extent cx="5760720" cy="2311942"/>
+            <wp:extent cx="5486400" cy="2598037"/>
             <wp:docPr id="7" name="Picture 7"/>
             <wp:cNvGraphicFramePr>
               <a:graphicFrameLocks noChangeAspect="1"/>
@@ -5335,11 +5908,86 @@
               <a:graphicData uri="http://schemas.openxmlformats.org/drawingml/2006/picture">
                 <pic:pic>
                   <pic:nvPicPr>
-                    <pic:cNvPr id="0" name="figure7_preload.png"/>
+                    <pic:cNvPr id="0" name="figure7_feasibility.png"/>
                     <pic:cNvPicPr/>
                   </pic:nvPicPr>
                   <pic:blipFill>
                     <a:blip r:embed="rId15"/>
+                    <a:stretch>
+                      <a:fillRect/>
+                    </a:stretch>
+                  </pic:blipFill>
+                  <pic:spPr>
+                    <a:xfrm>
+                      <a:off x="0" y="0"/>
+                      <a:ext cx="5486400" cy="2598037"/>
+                    </a:xfrm>
+                    <a:prstGeom prst="rect"/>
+                  </pic:spPr>
+                </pic:pic>
+              </a:graphicData>
+            </a:graphic>
+          </wp:inline>
+        </w:drawing>
+      </w:r>
+    </w:p>
+    <w:p>
+      <w:pPr>
+        <w:spacing w:line="240" w:lineRule="auto" w:after="200"/>
+      </w:pPr>
+      <w:r>
+        <w:rPr>
+          <w:sz w:val="19"/>
+        </w:rPr>
+        <w:t>Fig. 7 Design feasibility map: probability that bolting meets 2.5 h (colour and upper number) and median bolting time (lower number) against torque heads and bolt-transfer channels per flange, for (a) the legacy three-star-pass procedure and (b) a two-pass alternative that would require qualification.</w:t>
+      </w:r>
+    </w:p>
+    <w:p>
+      <w:pPr>
+        <w:spacing w:before="160" w:after="80"/>
+      </w:pPr>
+      <w:r>
+        <w:rPr>
+          <w:b/>
+          <w:sz w:val="22"/>
+        </w:rPr>
+        <w:t>5.7 Preload</w:t>
+      </w:r>
+    </w:p>
+    <w:p>
+      <w:pPr>
+        <w:spacing w:line="360" w:lineRule="auto"/>
+        <w:ind w:firstLine="432"/>
+      </w:pPr>
+      <w:r>
+        <w:rPr>
+          <w:i w:val="0"/>
+          <w:sz w:val="22"/>
+        </w:rPr>
+        <w:t>Fig. 8a shows that the ±2% torque accuracy stated for the system has almost no effect on preload scatter. With CV_K = 10%, preload CV is 10.4% for a ±2% tool, 10.7% for ±5% and 11.8% for ±10%; 32% of bolts fall outside ±10% of target even with the ±2% tool. Preload scatter is set by the nut factor, as the torque–tension literature leads one to expect [10–12]. The angle channel is what changes the outcome (Fig. 8b): with an angle-based preload estimate of 3% uncertainty and re-torque of bolts outside ±10%, the fraction outside falls from 32% to 5% (CV_K = 10%) and from 50% to 5% (CV_K = 15%), at the cost of re-torquing 34% and 51% of bolts respectively. With a 5% angle-estimate uncertainty the residual is about 10%; with 8% the benefit largely disappears. The value of torque–angle monitoring therefore depends on how well joint stiffness is known, which the validation plan measures.</w:t>
+      </w:r>
+    </w:p>
+    <w:p>
+      <w:pPr>
+        <w:jc w:val="center"/>
+      </w:pPr>
+      <w:r>
+        <w:drawing>
+          <wp:inline xmlns:a="http://schemas.openxmlformats.org/drawingml/2006/main" xmlns:pic="http://schemas.openxmlformats.org/drawingml/2006/picture">
+            <wp:extent cx="5760720" cy="2311942"/>
+            <wp:docPr id="8" name="Picture 8"/>
+            <wp:cNvGraphicFramePr>
+              <a:graphicFrameLocks noChangeAspect="1"/>
+            </wp:cNvGraphicFramePr>
+            <a:graphic>
+              <a:graphicData uri="http://schemas.openxmlformats.org/drawingml/2006/picture">
+                <pic:pic>
+                  <pic:nvPicPr>
+                    <pic:cNvPr id="0" name="figure8_preload.png"/>
+                    <pic:cNvPicPr/>
+                  </pic:nvPicPr>
+                  <pic:blipFill>
+                    <a:blip r:embed="rId16"/>
                     <a:stretch>
                       <a:fillRect/>
                     </a:stretch>
@@ -5366,7 +6014,7 @@
         <w:rPr>
           <w:sz w:val="19"/>
         </w:rPr>
-        <w:t>Fig. 7 (a) Achieved preload coefficient of variation against nut-factor variation for three tool accuracies. (b) Fraction of bolts outside ±10% of target under torque control alone and with torque–angle re-torque, for two nut-factor scatters and three angle-estimate uncertainties.</w:t>
+        <w:t>Fig. 8 (a) Achieved preload coefficient of variation against nut-factor variation for three tool accuracies. (b) Fraction of bolts outside ±10% of target under torque control alone and with torque–angle re-torque, for two nut-factor scatters and three angle-estimate uncertainties.</w:t>
       </w:r>
     </w:p>
     <w:p>
@@ -5378,7 +6026,7 @@
           <w:b/>
           <w:sz w:val="22"/>
         </w:rPr>
-        <w:t>5.7 Head handling</w:t>
+        <w:t>5.8 Head handling</w:t>
       </w:r>
     </w:p>
     <w:p>
@@ -5391,7 +6039,7 @@
           <w:i w:val="0"/>
           <w:sz w:val="22"/>
         </w:rPr>
-        <w:t>Without counterbalance, lifting a 5 t head at SF 1.5 from 6 bar air needs a 417 mm cylinder and a 10 t head 589 mm, beyond the largest standard bore. The minimum counterbalance fraction that keeps a single cylinder within 320 mm is 41% for 5 t, 70% for 10 t, 80% for 15 t and 85% for 20 t (Fig. 8). A pneumatic manipulator is therefore feasible only as a counterbalanced device in which air supplies the balance correction and motion, not the lift, consistent with passive gravity compensation [21]. Compressibility also makes a pneumatic axis compliant, so the final seating of the head must rely on mechanical guides and alignment pins, and holding must rely on a spring-applied mechanical lock rather than on air pressure.</w:t>
+        <w:t>Without counterbalance, lifting a 5 t head at SF 1.5 from 6 bar air needs a 417 mm cylinder and a 10 t head 589 mm, beyond the largest standard bore. The minimum counterbalance fraction that keeps a single cylinder within 320 mm is 41% for 5 t, 70% for 10 t, 80% for 15 t and 85% for 20 t (Fig. 9). A pneumatic manipulator is therefore feasible only as a counterbalanced device in which air supplies the balance correction and motion, not the lift, consistent with passive gravity compensation [21]. Compressibility also makes a pneumatic axis compliant, so the final seating of the head must rely on mechanical guides and alignment pins, and holding must rely on a spring-applied mechanical lock rather than on air pressure.</w:t>
       </w:r>
     </w:p>
     <w:p>
@@ -5402,7 +6050,7 @@
         <w:drawing>
           <wp:inline xmlns:a="http://schemas.openxmlformats.org/drawingml/2006/main" xmlns:pic="http://schemas.openxmlformats.org/drawingml/2006/picture">
             <wp:extent cx="4754880" cy="3067013"/>
-            <wp:docPr id="8" name="Picture 8"/>
+            <wp:docPr id="9" name="Picture 9"/>
             <wp:cNvGraphicFramePr>
               <a:graphicFrameLocks noChangeAspect="1"/>
             </wp:cNvGraphicFramePr>
@@ -5410,11 +6058,11 @@
               <a:graphicData uri="http://schemas.openxmlformats.org/drawingml/2006/picture">
                 <pic:pic>
                   <pic:nvPicPr>
-                    <pic:cNvPr id="0" name="figure8_manipulator.png"/>
+                    <pic:cNvPr id="0" name="figure9_manipulator.png"/>
                     <pic:cNvPicPr/>
                   </pic:nvPicPr>
                   <pic:blipFill>
-                    <a:blip r:embed="rId16"/>
+                    <a:blip r:embed="rId17"/>
                     <a:stretch>
                       <a:fillRect/>
                     </a:stretch>
@@ -5441,7 +6089,7 @@
         <w:rPr>
           <w:sz w:val="19"/>
         </w:rPr>
-        <w:t>Fig. 8 Single-cylinder bore needed to lift a head against its unbalanced weight, as a function of head mass and counterbalance fraction. Head mass was not available and is swept.</w:t>
+        <w:t>Fig. 9 Single-cylinder bore needed to lift a head against its unbalanced weight, as a function of head mass and counterbalance fraction. Head mass was not available and is swept.</w:t>
       </w:r>
     </w:p>
     <w:p>
@@ -5453,7 +6101,7 @@
           <w:b/>
           <w:sz w:val="22"/>
         </w:rPr>
-        <w:t>5.8 Control logic</w:t>
+        <w:t>5.9 Control logic</w:t>
       </w:r>
     </w:p>
     <w:p>
@@ -5466,7 +6114,7 @@
           <w:i w:val="0"/>
           <w:sz w:val="22"/>
         </w:rPr>
-        <w:t>With the full interlock set and the resume rule, exhaustive exploration finds no safety violation: 715 reachable states and 366080 checked transitions for a 12-bolt flange (347 and 177664 for 4 bolts), with all 13 modes reachable and no deadlocked state. Every mutant is detected (Table 6), so each invariant is capable of failing. The liveness check, however, found a defect in the logic as first specified. Without an explicit rule for resuming an interrupted phase, 1232 of 2105 reachable states for a 12-bolt flange (144 of 385 for 4 bolts) can never reach OPEN or CLOSED: an emergency stop part-way through unbolting or tightening leaves a partially bolted joint from which the prose interlocks provide no way forward, so the operator would have to leave the automated system. Adding the rule that atmosphere confirmation routes to the interrupted phase — continue unbolting, resume tightening at the next unverified bolt, repeat the leak test or await sign-off — removes every deadlock while preserving all seven invariants.</w:t>
+        <w:t>With the full interlock set and the resume rule, exhaustive exploration finds no safety violation: 715 reachable states and 366080 checked transitions for a 12-bolt flange (347 and 177664 for 4 bolts), with all 13 modes reachable and no deadlocked state. Every mutant is detected (Table 7), so each invariant is capable of failing. The liveness check, however, found a defect in the logic as first specified. Without an explicit rule for resuming an interrupted phase, 1232 of 2105 reachable states for a 12-bolt flange (144 of 385 for 4 bolts) can never reach OPEN or CLOSED: an emergency stop part-way through unbolting or tightening leaves a partially bolted joint from which the prose interlocks provide no way forward, so the operator would have to leave the automated system. Adding the rule that atmosphere confirmation routes to the interrupted phase — continue unbolting, resume tightening at the next unverified bolt, repeat the leak test or await sign-off — removes every deadlock while preserving all seven invariants.</w:t>
       </w:r>
     </w:p>
     <w:tbl>
@@ -5916,7 +6564,7 @@
         <w:rPr>
           <w:sz w:val="19"/>
         </w:rPr>
-        <w:t>Table 6. Mutation test of the interlock logic (4-bolt flange). Each interlock removed in isolation is caught by the invariant it protects.</w:t>
+        <w:t>Table 7. Mutation test of the interlock logic (4-bolt flange). Each interlock removed in isolation is caught by the invariant it protects.</w:t>
       </w:r>
     </w:p>
     <w:p>
@@ -5928,7 +6576,7 @@
           <w:b/>
           <w:sz w:val="22"/>
         </w:rPr>
-        <w:t>5.9 Failure modes</w:t>
+        <w:t>5.10 Failure modes</w:t>
       </w:r>
     </w:p>
     <w:p>
@@ -5941,7 +6589,7 @@
           <w:i w:val="0"/>
           <w:sz w:val="22"/>
         </w:rPr>
-        <w:t>The highest-ranked failure mode (Fig. 9, Table 7) is an out-of-window preload that goes undetected (RPN 160), which follows directly from Section 5.6: torque control alone cannot see a nut-factor outlier, and detection depends on the angle channel. Second is failure of gas detection to register residual hydrocarbons (RPN 150, severity 10), which is why the design specifies voted redundant detectors and a pre-cycle functional test. The failure modes with the highest severity but lower RPN — head release with a bolt engaged and loss of air under load — are those the interlocks and the mechanical lock address by design; their low RPN reflects the control, not the absence of the hazard.</w:t>
+        <w:t>The highest-ranked failure mode (Fig. 10, Table 8) is an out-of-window preload that goes undetected (RPN 160), which follows directly from Section 5.7: torque control alone cannot see a nut-factor outlier, and detection depends on the angle channel. Second is failure of gas detection to register residual hydrocarbons (RPN 150, severity 10), which is why the design specifies voted redundant detectors and a pre-cycle functional test. The failure modes with the highest severity but lower RPN — head release with a bolt engaged and loss of air under load — are those the interlocks and the mechanical lock address by design; their low RPN reflects the control, not the absence of the hazard.</w:t>
       </w:r>
     </w:p>
     <w:p>
@@ -5952,7 +6600,7 @@
         <w:drawing>
           <wp:inline xmlns:a="http://schemas.openxmlformats.org/drawingml/2006/main" xmlns:pic="http://schemas.openxmlformats.org/drawingml/2006/picture">
             <wp:extent cx="5760720" cy="2702727"/>
-            <wp:docPr id="9" name="Picture 9"/>
+            <wp:docPr id="10" name="Picture 10"/>
             <wp:cNvGraphicFramePr>
               <a:graphicFrameLocks noChangeAspect="1"/>
             </wp:cNvGraphicFramePr>
@@ -5960,11 +6608,11 @@
               <a:graphicData uri="http://schemas.openxmlformats.org/drawingml/2006/picture">
                 <pic:pic>
                   <pic:nvPicPr>
-                    <pic:cNvPr id="0" name="figure9_fmea.png"/>
+                    <pic:cNvPr id="0" name="figure10_fmea.png"/>
                     <pic:cNvPicPr/>
                   </pic:nvPicPr>
                   <pic:blipFill>
-                    <a:blip r:embed="rId17"/>
+                    <a:blip r:embed="rId18"/>
                     <a:stretch>
                       <a:fillRect/>
                     </a:stretch>
@@ -5991,7 +6639,7 @@
         <w:rPr>
           <w:sz w:val="19"/>
         </w:rPr>
-        <w:t>Fig. 9 Design FMEA ranked by risk priority number; colour indicates severity. Scores are the author's judgement and are listed with their controls in Table 7.</w:t>
+        <w:t>Fig. 10 Design FMEA ranked by risk priority number; colour indicates severity. Scores are the author's judgement and are listed with their controls in Table 8.</w:t>
       </w:r>
     </w:p>
     <w:tbl>
@@ -7598,7 +8246,7 @@
         <w:rPr>
           <w:sz w:val="19"/>
         </w:rPr>
-        <w:t>Table 7. Design FMEA (1–10 scales; D = 10 is undetectable).</w:t>
+        <w:t>Table 8. Design FMEA (1–10 scales; D = 10 is undetectable).</w:t>
       </w:r>
     </w:p>
     <w:p>
@@ -7610,7 +8258,7 @@
           <w:b/>
           <w:sz w:val="22"/>
         </w:rPr>
-        <w:t>5.10 Automation coverage and exposure</w:t>
+        <w:t>5.11 Automation coverage and exposure</w:t>
       </w:r>
     </w:p>
     <w:tbl>
@@ -8007,7 +8655,7 @@
         <w:rPr>
           <w:sz w:val="19"/>
         </w:rPr>
-        <w:t>Table 8. Operations, modelled durations (one-head configuration, medians) and automation levels used in the coverage metric.</w:t>
+        <w:t>Table 9. Operations, modelled durations (one-head configuration, medians) and automation levels used in the coverage metric.</w:t>
       </w:r>
     </w:p>
     <w:p>
@@ -8020,7 +8668,7 @@
           <w:i w:val="0"/>
           <w:sz w:val="22"/>
         </w:rPr>
-        <w:t>Weighted by modelled duration, automation coverage is A = 0.94 (Table 8). The reported manual procedure places four to six workers in the hazard zone for four to six hours, 16–36 person-hours per operation; with the automated system the routine value is zero, rising to at most 0.46 person-hours if gasket cassette loading has to be done at the flange rather than from outside the zone. The exposure reduction is the least uncertain benefit of the architecture: it does not depend on the step times that dominate the cycle-time uncertainty.</w:t>
+        <w:t>Weighted by modelled duration, automation coverage is A = 0.94 (Table 9). The reported manual procedure places four to six workers in the hazard zone for four to six hours, 16–36 person-hours per operation; with the automated system the routine value is zero, rising to at most 0.46 person-hours if gasket cassette loading has to be done at the flange rather than from outside the zone. The exposure reduction is the least uncertain benefit of the architecture: it does not depend on the step times that dominate the cycle-time uncertainty.</w:t>
       </w:r>
     </w:p>
     <w:p>
@@ -8057,7 +8705,7 @@
           <w:i w:val="0"/>
           <w:sz w:val="22"/>
         </w:rPr>
-        <w:t>The analysis supports two of the three original targets and conditions the third. The exposure target is met by design. The torque-accuracy target is achievable but, on its own, does not deliver the preload quality it appears to promise; what delivers it is the angle channel. The cycle-time target is not met by the architecture as first described, with one runner per flange, under any combination of assumed step times. The 8.0 h single-head result is not a failure of the concept but a finding about it: a single tool is the wrong architecture for a 92-bolt, multi-pass closure. The architecture the analysis supports has four synchronised heads per flange, one bolt-transfer channel per head and, if validated, a two-star-pass procedure, which brings bolting from 8.0 h to 1.6 h. Parallelisation, not faster tools, is what matters: the admissibility analysis shows that no plausible per-bolt time lets one head meet the target, and once torque application is parallelised every stage around it — bolt handling above all — must be parallelised too. This is a substantially larger and more expensive machine than the original proposal implied, and it changes the comparison with manual work: a single automated head is slower than a crew of four to six, and the automated system matches or improves on manual duration only when it too works several bolts at once. The target also has to be read as the source stated it, for bolting: the complete operation remains about 3.4 h, governed by head handling and the leak test, and shortening it is a separate design problem for those subsystems.</w:t>
+        <w:t>The analysis supports two of the three original targets and conditions the third. The exposure target is met by design. The torque-accuracy target is achievable but, on its own, does not deliver the preload quality it appears to promise; what delivers it is the angle channel. The cycle-time target is not met by the architecture as first described, with one runner per flange, anywhere within the investigated parameter bounds. The 8.0 h single-head result is not a failure of the concept but a finding about it: a single tool is the wrong architecture for a 92-bolt, multi-pass closure. The architecture the analysis supports has four synchronised heads per flange and one bolt-transfer channel per head, with the legacy tightening procedure unchanged, which brings bolting from 8.0 h to 1.8 h; a qualified two-star-pass procedure is an optional further step, not a requirement. Parallelisation, not faster tools, is what matters: the admissibility analysis shows that no plausible per-bolt time lets one head meet the target, and once torque application is parallelised every stage around it — bolt handling above all — must be parallelised too. This is a substantially larger and more expensive machine than the original proposal implied, and it changes the comparison with manual work: a single automated head is slower than a crew of four to six, and the automated system matches or improves on manual duration only when it too works several bolts at once. The target also has to be read as the source stated it, for bolting: the complete operation remains about 3.4 h, governed by head handling and the leak test, and shortening it is a separate design problem for those subsystems.</w:t>
       </w:r>
     </w:p>
     <w:p>
@@ -8157,7 +8805,7 @@
           <w:i w:val="0"/>
           <w:sz w:val="22"/>
         </w:rPr>
-        <w:t>The source proposal described hazardous-area certification of the integrated system as achievable by selecting certified components. Component certification is necessary but not sufficient: the integrated assembly, including carriage drives, transducers, the carousel and the controller, must satisfy the applicable protection concepts as a whole [25–27]. The gas-clearance and head-motion interlocks are safety functions, and their integrity requirements belong to a functional-safety assessment [28]. The exhaustive check in Section 5.8 shows that the logic is consistent and deadlock-free as specified; it does not establish the hardware fault tolerance or safety integrity level of its implementation.</w:t>
+        <w:t>The source proposal described hazardous-area certification of the integrated system as achievable by selecting certified components. Component certification is necessary but not sufficient: the integrated assembly, including carriage drives, transducers, the carousel and the controller, must satisfy the applicable protection concepts as a whole [25–27]. The gas-clearance and head-motion interlocks are safety functions, and their integrity requirements belong to a functional-safety assessment [28]. The exhaustive check in Section 5.9 shows that the logic is consistent and deadlock-free as specified; it does not establish the hardware fault tolerance or safety integrity level of its implementation.</w:t>
       </w:r>
     </w:p>
     <w:p>
@@ -8194,7 +8842,7 @@
           <w:b/>
           <w:sz w:val="24"/>
         </w:rPr>
-        <w:t>7 Validation plan</w:t>
+        <w:t>7 Experimental validation and falsification plan</w:t>
       </w:r>
     </w:p>
     <w:p>
@@ -8207,7 +8855,7 @@
           <w:i w:val="0"/>
           <w:sz w:val="22"/>
         </w:rPr>
-        <w:t>The predictions above can be falsified by a staged test programme. Table 9 lists the measurements, the rig on which each is made and the acceptance criterion that would confirm or refute the corresponding result.</w:t>
+        <w:t>The predictions above can be falsified by a staged test programme. Table 10 lists the measurements, the rig on which each is made and the acceptance criterion that would confirm or refute the corresponding result.</w:t>
       </w:r>
     </w:p>
     <w:tbl>
@@ -8590,7 +9238,7 @@
               <w:rPr>
                 <w:sz w:val="17"/>
               </w:rPr>
-              <w:t>Measured CV_K; preload prediction of Fig. 7a to be confirmed within ±2 points</w:t>
+              <w:t>Measured CV_K; preload prediction of Fig. 8a to be confirmed within ±2 points</w:t>
             </w:r>
           </w:p>
         </w:tc>
@@ -8643,7 +9291,7 @@
               <w:rPr>
                 <w:sz w:val="17"/>
               </w:rPr>
-              <w:t>CV_θ ≤ 5% for the torque–angle benefit of Fig. 7b to hold</w:t>
+              <w:t>CV_θ ≤ 5% for the torque–angle benefit of Fig. 8b to hold</w:t>
             </w:r>
           </w:p>
         </w:tc>
@@ -8816,7 +9464,7 @@
         <w:rPr>
           <w:sz w:val="19"/>
         </w:rPr>
-        <w:t>Table 9. Validation measurements and acceptance criteria. A pilot on one bottom head is proposed only after the single-station and mock-up tests have been passed.</w:t>
+        <w:t>Table 10. Validation measurements and acceptance criteria. A pilot on one bottom head is proposed only after the single-station and mock-up tests have been passed.</w:t>
       </w:r>
     </w:p>
     <w:p>
@@ -8841,7 +9489,36 @@
           <w:i w:val="0"/>
           <w:sz w:val="22"/>
         </w:rPr>
-        <w:t>Each subsystem uses established technology — pneumatic torque multipliers, rails and carriages, fastener magazines, counterbalanced manipulators and programmable controllers — so the development risk lies in integration and in the hazardous-area environment rather than in any single component. The preliminary cost estimates of the source proposal, about US$0.14–0.20 million for a single-flange pilot and US$0.74–1.1 million for all three flanges on four drums, assumed one runner per flange. The results of Section 5 imply a four-head carriage and four bolt-transfer channels on each flange if the bolting target is to be met, so those estimates are likely to be low and should be revised after the single-station tests; shortening the complete operation further would require faster head handling and leak testing, which were not costed. A staged programme — single-station rig, full-flange mock-up, then a pilot on one bottom head — allows the project to stop cheaply if the measured step times, nut-factor scatter or engagement success fall outside the ranges on which the results depend.</w:t>
+        <w:t>Each subsystem uses established technology — pneumatic torque multipliers, rails and carriages, fastener magazines, counterbalanced manipulators and programmable controllers — so the development risk lies in integration and in the hazardous-area environment rather than in any single component. The preliminary cost estimates of the source proposal, about US$0.14–0.20 million for a single-flange pilot and US$0.74–1.1 million for all three flanges on four drums, assumed one runner per flange. The results of Section 5 imply a four-head carriage and four bolt-transfer channels on each flange if the bolting target is to be met, so those estimates are likely to be low and should be revised after the single-station tests; shortening the complete operation further would require faster head handling and leak testing, which were not costed. Rather than substitute another point estimate, the revised cost per flange is structured as</w:t>
+      </w:r>
+    </w:p>
+    <w:p>
+      <w:pPr>
+        <w:spacing w:line="288" w:lineRule="auto"/>
+        <w:ind w:left="864"/>
+      </w:pPr>
+      <w:r>
+        <w:rPr>
+          <w:i/>
+        </w:rPr>
+        <w:t>C = C_fixed + r·C_head + c·C_channel + C_controls + C_certification</w:t>
+      </w:r>
+      <w:r>
+        <w:tab/>
+        <w:tab/>
+        <w:t>(15)</w:t>
+      </w:r>
+    </w:p>
+    <w:p>
+      <w:pPr>
+        <w:spacing w:line="360" w:lineRule="auto"/>
+      </w:pPr>
+      <w:r>
+        <w:rPr>
+          <w:i w:val="0"/>
+          <w:sz w:val="22"/>
+        </w:rPr>
+        <w:t>with r = 4 heads and c = 4 transfer channels in the recommended configuration; the coefficients — rail and structure, each torque head, each transfer channel, the controls and the hazardous-area certification of the integrated assembly — require vendor quotations and are not estimated here. A staged programme — single-station rig, full-flange mock-up, then a pilot on one bottom head — allows the project to stop cheaply if the measured step times, nut-factor scatter or engagement success fall outside the ranges on which the results depend.</w:t>
       </w:r>
     </w:p>
     <w:p>
@@ -8866,7 +9543,7 @@
           <w:i w:val="0"/>
           <w:sz w:val="22"/>
         </w:rPr>
-        <w:t>An automated architecture for opening and closing a 92-bolt, three-flange pressure vessel was evaluated by simulation against the targets originally claimed for it. With one torque head per flange, bolting takes a median 8.0 h and cannot meet a 2.5 h target under any assumed step times: a single tool is the wrong architecture for this closure. Parallelising in stages brings bolting to 2.3 h with four synchronised heads, 1.8 h with a bolt-transfer channel per head and 1.6 h with one fewer star pass, the last subject to validation of preload uniformity. An exactly optimised tool path and pipelined servicing add little, the first because the opposite-bolt rule fixes most of the travel and the second because the bottom head is on the critical path in every phase. The complete operation remains about 3.4 h, governed by head handling and the leak test, so the 2.5 h target holds for bolting but not for the whole operation. Specifying ±2% torque accuracy does little for preload, which nut-factor scatter dominates, whereas torque–angle verification with re-torque substantially narrows it. The interlock logic is safe as specified but deadlocks after an interrupted sequence unless an explicit resume rule is added. Pneumatic head handling requires a counterbalance carrying most of the load. The reduction in hazard-zone exposure, from 16–36 person-hours to essentially none, is the most robust benefit. These are predictions, and the validation plan specifies the measurements that would confirm or overturn them.</w:t>
+        <w:t>An automated architecture for opening and closing a 92-bolt, three-flange pressure vessel was evaluated by simulation against the targets originally claimed for it. With one torque head per flange, bolting takes a median 8.0 h and cannot meet a 2.5 h target within the investigated parameter bounds: a single tool is the wrong architecture for this closure. Parallelising in stages brings bolting to 2.3 h with four synchronised heads and 1.8 h with a bolt-transfer channel per head. That machine-only configuration, with the legacy tightening procedure unchanged, is the recommended design: it meets the bolting target in 98% of samples, and the ranking of architectures that leads to it holds in every sample under uniform, triangular and correlated input models. One fewer star pass would bring bolting to 1.6 h but is an optional process change that requires qualification of preload uniformity. An exactly optimised tool path and pipelined servicing add little, the first because the opposite-bolt rule fixes most of the travel and the second because the bottom head is on the critical path in every phase. The complete operation remains about 3.4 h, governed by head handling and the leak test, so the 2.5 h target holds for bolting but not for the whole operation; Eq. (14) gives the servicing-time envelope a faster design would have to meet. Specifying ±2% torque accuracy does little for preload, which nut-factor scatter dominates, whereas torque–angle verification with re-torque substantially narrows it, to an extent that depends on how well joint stiffness is known. Explicit-state verification found no violation of the seven safety invariants but exposed widespread deadlock in the initial interlock specification after interrupted sequences; adding an explicit resume rule eliminated every deadlock while preserving all seven invariants. Pneumatic head handling requires a counterbalance carrying most of the load. The reduction in hazard-zone exposure, from 16–36 person-hours to essentially none, is the most robust benefit. These are predictions, and the validation plan specifies the measurements that would confirm or overturn them.</w:t>
       </w:r>
     </w:p>
     <w:p>

</xml_diff>

<commit_message>
Manuscript: neutral wording in 5.6; limitations point to the robustness analysis
Co-Authored-By: Claude Opus 5.5 <noreply@anthropic.com>
</commit_message>
<xml_diff>
--- a/manuscript/PABHS_IJAMT_Manuscript.docx
+++ b/manuscript/PABHS_IJAMT_Manuscript.docx
@@ -5876,7 +5876,7 @@
           <w:i w:val="0"/>
           <w:sz w:val="22"/>
         </w:rPr>
-        <w:t>The step-time ranges of Table 2 are assumptions, and so are the uniform distributions and the independence with which they are sampled. A reviewer could reasonably argue that a large, badly aligned bolt takes longer to align, engage and torque and is also likelier to need a retry or review, so that those inputs move together. Table 6 repeats the analysis under two alternatives: triangular distributions centred on the nominal value, and a pessimistic case in which those six inputs are positively correlated. The medians barely move, because the ranges are unchanged; the tails do. In the correlated case the probability that the recommended configuration B meets 2.5 h falls from 0.98 to 0.92 and its 95th percentile rises from 2.37 to 2.60 h, whereas under triangular distributions it rises to 0.997. What does not change is the architectural ranking: one head is slower than two, two slower than four, and four heads with a single carousel slower than four with four transfer channels, in every one of the 20000 samples under all three models. The paper's central claim is that ranking, not the particular value of 1.82 h.</w:t>
+        <w:t>The step-time ranges of Table 2 are assumptions, and so are the uniform distributions and the independence with which they are sampled. It is plausible that a large, badly aligned bolt takes longer to align, engage and torque and is also likelier to need a retry or review, so that those inputs move together. Table 6 repeats the analysis under two alternatives: triangular distributions centred on the nominal value, and a pessimistic case in which those six inputs are positively correlated. The medians barely move, because the ranges are unchanged; the tails do. In the correlated case the probability that the recommended configuration B meets 2.5 h falls from 0.98 to 0.92 and its 95th percentile rises from 2.37 to 2.60 h, whereas under triangular distributions it rises to 0.997. What does not change is the architectural ranking: one head is slower than two, two slower than four, and four heads with a single carousel slower than four with four transfer channels, in every one of the 20000 samples under all three models. The paper's central claim is that ranking, not the particular value of 1.82 h.</w:t>
       </w:r>
     </w:p>
     <w:p>
@@ -8830,7 +8830,7 @@
           <w:i w:val="0"/>
           <w:sz w:val="22"/>
         </w:rPr>
-        <w:t>Every performance figure in this paper is a model prediction. The step-time ranges in Table 2 are assumptions, bounded but not measured; the bolt-circle diameters are bracketed by a spacing rule; head masses are swept. Elastic interaction is represented only through the number of passes, not modelled directly. The preload model treats nut factor and angle-estimate errors as independent and normally distributed. The FMEA scores are judgement. The control-logic verification abstracts the controller to a finite-state model and checks it for flanges of 4, 8 and 12 bolts; its conclusions concern the logic, not an implementation. The manual baseline of 4–6 h is as reported, not measured. Costs are not analysed beyond the preliminary estimates noted in Section 8.</w:t>
+        <w:t>Every performance figure in this paper is a model prediction. The step-time ranges in Table 2 are assumptions, bounded but not measured; the bolt-circle diameters are bracketed by a spacing rule; head masses are swept. The distributions and their independence are also assumptions; Section 5.6 shows that they move the tails of the cycle-time distribution but not the ranking of architectures. Elastic interaction is represented only through the number of passes, not modelled directly. The preload model treats nut factor and angle-estimate errors as independent and normally distributed. The FMEA scores are judgement. The control-logic verification abstracts the controller to a finite-state model and checks it for flanges of 4, 8 and 12 bolts; its conclusions concern the logic, not an implementation. The manual baseline of 4–6 h is as reported, not measured. Costs are not analysed beyond the preliminary estimates noted in Section 8.</w:t>
       </w:r>
     </w:p>
     <w:p>

</xml_diff>

<commit_message>
Submission version: wording qualified to the evidence, 600 dpi TIFFs, Zenodo DOIs
- 'recommended' -> preferred / recommended for experimental development
- exposure benefit stated as designed-for and least sensitive to cycle-time assumptions
- ranking 'held across all 20,000 simulated samples'
- figure TIFFs at 600 dpi (Springer combination artwork)
- code DOI 10.5281/zenodo.22969548 and preprint DOI 10.5281/zenodo.22969550 (reserved)

Co-Authored-By: Claude Opus 5.5 <noreply@anthropic.com>
</commit_message>
<xml_diff>
--- a/manuscript/PABHS_IJAMT_Manuscript.docx
+++ b/manuscript/PABHS_IJAMT_Manuscript.docx
@@ -71,7 +71,7 @@
           <w:i w:val="0"/>
           <w:sz w:val="22"/>
         </w:rPr>
-        <w:t>Large bolted closures on process vessels are still assembled largely by hand, often in hazardous areas, using multi-pass tightening sequences whose duration and preload outcome are rarely quantified. This paper evaluates by simulation an automated architecture for such closures: orbital pneumatic torque runners on the flange, a bolt-management carousel, a counterbalanced head manipulator and an interlocking sequence controller, applied to a 92-bolt, three-flange delayed-coking drum. A Monte Carlo model built on the actual star-pattern tool travel shows that one torque head per flange needs a median 8.0 h to unbolt and re-bolt the drum and, within the investigated parameter bounds, cannot meet a 2.5 h target. Removing bottlenecks in turn gives 2.3 h with four synchronised heads and 1.8 h with a bolt-transfer channel per head, the recommended machine-only configuration, which meets 2.5 h in 98% of samples; one fewer star pass would give 1.6 h but requires qualification. This ranking holds in every sample under uniform, triangular and correlated input models. An exactly optimised tool path adds little, and the complete operation remains about 3.4 h, governed by head handling and leak testing. Specifying ±2% torque accuracy barely affects preload scatter; under an assumed 3% angle-based preload-estimate uncertainty, torque–angle re-torque cuts bolts outside ±10% of target from 32% to 5%. Exhaustive verification found no safety violation but exposed deadlocks after interrupted sequences, which a resume rule removed. All results are predictions; an experimental falsification plan is given.</w:t>
+        <w:t>Large bolted closures on process vessels are still assembled largely by hand, often in hazardous areas, using multi-pass tightening sequences whose duration and preload outcome are rarely quantified. This paper evaluates by simulation an automated architecture for such closures: orbital pneumatic torque runners on the flange, a bolt-management carousel, a counterbalanced head manipulator and an interlocking sequence controller, applied to a 92-bolt, three-flange delayed-coking drum. A Monte Carlo model built on the actual star-pattern tool travel shows that one torque head per flange needs a median 8.0 h to unbolt and re-bolt the drum and, within the investigated parameter bounds, cannot meet a 2.5 h target. Removing bottlenecks in turn gives 2.3 h with four synchronised heads and 1.8 h with a bolt-transfer channel per head, the preferred simulated configuration, which meets 2.5 h in 98% of samples; one fewer star pass would give 1.6 h but requires qualification. This ranking held across all 20,000 simulated samples under uniform, triangular and correlated input models. An exactly optimised tool path adds little, and the complete operation remains about 3.4 h, governed by head handling and leak testing. Specifying ±2% torque accuracy barely affects preload scatter; under an assumed 3% angle-based preload-estimate uncertainty, torque–angle re-torque cuts bolts outside ±10% of target from 32% to 5%. Exhaustive verification found no safety violation but exposed deadlocks after interrupted sequences, which a resume rule removed. All results are predictions; an experimental falsification plan is given.</w:t>
       </w:r>
     </w:p>
     <w:p>
@@ -5215,7 +5215,7 @@
           <w:i w:val="0"/>
           <w:sz w:val="22"/>
         </w:rPr>
-        <w:t>Table 5 and Fig. 6 remove the bottlenecks in turn. Giving each of the four heads its own bolt-transfer channel, for example a carousel with four access stations, cuts bolting from 2.28 to 1.82 h and raises the probability of meeting 2.5 h from 0.73 to 0.98. This is a change to the machine alone, with the legacy tightening procedure unaltered, and it is the configuration the analysis recommends: four heads and four transfer channels meet the bolting target without any change to how the joint is assembled. Removing one star pass brings bolting further to 1.60 h, inside the target in every sample, but this is a change to the joint-assembly procedure rather than to the machine. It is an optional process improvement, admissible only if a reduced-pass procedure of the kind described as an alternative to the legacy sequence [7] is shown to give equivalent preload uniformity on the actual joint (Section 7); the architecture does not depend on it.</w:t>
+        <w:t>Table 5 and Fig. 6 remove the bottlenecks in turn. Giving each of the four heads its own bolt-transfer channel, for example a carousel with four access stations, cuts bolting from 2.28 to 1.82 h and raises the probability of meeting 2.5 h from 0.73 to 0.98. This is a change to the machine alone, with the legacy tightening procedure unaltered, and it is the configuration the present analysis supports and recommends for experimental development: four heads and four transfer channels meet the bolting target without any change to how the joint is assembled. Removing one star pass brings bolting further to 1.60 h, inside the target in all simulated samples, but this is a change to the joint-assembly procedure rather than to the machine. It is an optional process improvement, admissible only if a reduced-pass procedure of the kind described as an alternative to the legacy sequence [7] is shown to give equivalent preload uniformity on the actual joint (Section 7); the architecture does not depend on it.</w:t>
       </w:r>
     </w:p>
     <w:p>
@@ -5228,7 +5228,7 @@
           <w:i w:val="0"/>
           <w:sz w:val="22"/>
         </w:rPr>
-        <w:t>The exactly optimised tool path adds little, and it is reported for what it shows rather than as part of the recommended design. With four heads it cuts carriage travel per star pass on the bottom head from 2.68 to 1.51 bolt-circle diameters, but travel is by then a small part of the cycle and bolting falls only from 1.60 to 1.57 h. With one head, where travel matters, the optimum reduces travel per star pass only from 56.5 to 55.0 diameters and bolting from 7.96 to 7.91 h. The reason is structural: most of the single-head travel is incurred within each quartet, because opposite bolts, half a turn apart, must be loaded consecutively, and no ordering of the quartets can remove that. The wasted motion of Fig. 2 is thus a consequence of serving a symmetric loading rule with one tool, and the remedy is more tools rather than a better path. Pipelining the servicing steps changes nothing (3.43 h in both D and E) because the bottom head, with the most bolts and a head to handle, is on the critical path in every phase, so the other flanges' chains finish within it.</w:t>
+        <w:t>The exactly optimised tool path adds little, and it is reported for what it shows rather than as part of the preferred configuration. With four heads it cuts carriage travel per star pass on the bottom head from 2.68 to 1.51 bolt-circle diameters, but travel is by then a small part of the cycle and bolting falls only from 1.60 to 1.57 h. With one head, where travel matters, the optimum reduces travel per star pass only from 56.5 to 55.0 diameters and bolting from 7.96 to 7.91 h. The reason is structural: most of the single-head travel is incurred within each quartet, because opposite bolts, half a turn apart, must be loaded consecutively, and no ordering of the quartets can remove that. The wasted motion of Fig. 2 is thus a consequence of serving a symmetric loading rule with one tool, and the remedy is more tools rather than a better path. Pipelining the servicing steps changes nothing (3.43 h in both D and E) because the bottom head, with the most bolts and a head to handle, is on the critical path in every phase, so the other flanges' chains finish within it.</w:t>
       </w:r>
     </w:p>
     <w:p>
@@ -5283,7 +5283,7 @@
           <w:i w:val="0"/>
           <w:sz w:val="22"/>
         </w:rPr>
-        <w:t>With the recommended configuration B (median bolting 1.82 h) the servicing budget is 0.68 h, or 41 min; with the optional reduced-pass configuration C (1.60 h) it is 0.90 h, or 54 min. The assumed servicing ranges give 1.85 h at the median and 1.12 h at best. With configuration C, a 2.5 h complete operation would need, for example, head handling of about 10 min each way, gasket and face work of about 10 min, a leak test of about 15 min and atmosphere confirmation under 5 min, about 50 min in all; with B the same steps would have to fit in about 40 min. Either is roughly a halving of every servicing step. Equation (14) is the envelope any faster head-handling or leak-test design would have to meet; no such design is evaluated here.</w:t>
+        <w:t>With the preferred configuration B (median bolting 1.82 h) the servicing budget is 0.68 h, or 41 min; with the optional reduced-pass configuration C (1.60 h) it is 0.90 h, or 54 min. The assumed servicing ranges give 1.85 h at the median and 1.12 h at best. With configuration C, a 2.5 h complete operation would need, for example, head handling of about 10 min each way, gasket and face work of about 10 min, a leak test of about 15 min and atmosphere confirmation under 5 min, about 50 min in all; with B the same steps would have to fit in about 40 min. Either is roughly a halving of every servicing step. Equation (14) is the envelope any faster head-handling or leak-test design would have to meet; no such design is evaluated here.</w:t>
       </w:r>
     </w:p>
     <w:p>
@@ -5876,7 +5876,7 @@
           <w:i w:val="0"/>
           <w:sz w:val="22"/>
         </w:rPr>
-        <w:t>The step-time ranges of Table 2 are assumptions, and so are the uniform distributions and the independence with which they are sampled. It is plausible that a large, badly aligned bolt takes longer to align, engage and torque and is also likelier to need a retry or review, so that those inputs move together. Table 6 repeats the analysis under two alternatives: triangular distributions centred on the nominal value, and a pessimistic case in which those six inputs are positively correlated. The medians barely move, because the ranges are unchanged; the tails do. In the correlated case the probability that the recommended configuration B meets 2.5 h falls from 0.98 to 0.92 and its 95th percentile rises from 2.37 to 2.60 h, whereas under triangular distributions it rises to 0.997. What does not change is the architectural ranking: one head is slower than two, two slower than four, and four heads with a single carousel slower than four with four transfer channels, in every one of the 20000 samples under all three models. The paper's central claim is that ranking, not the particular value of 1.82 h.</w:t>
+        <w:t>The step-time ranges of Table 2 are assumptions, and so are the uniform distributions and the independence with which they are sampled. It is plausible that a large, badly aligned bolt takes longer to align, engage and torque and is also likelier to need a retry or review, so that those inputs move together. Table 6 repeats the analysis under two alternatives: triangular distributions centred on the nominal value, and a pessimistic case in which those six inputs are positively correlated. The medians barely move, because the ranges are unchanged; the tails do. In the correlated case the probability that the preferred configuration B meets 2.5 h falls from 0.98 to 0.92 and its 95th percentile rises from 2.37 to 2.60 h, whereas under triangular distributions it rises to 0.997. What does not change is the architectural ranking: one head is slower than two, two slower than four, and four heads with a single carousel slower than four with four transfer channels, across all 20000 simulated samples under all three models. The paper's central claim is that ranking, not the particular value of 1.82 h.</w:t>
       </w:r>
     </w:p>
     <w:p>
@@ -8668,7 +8668,7 @@
           <w:i w:val="0"/>
           <w:sz w:val="22"/>
         </w:rPr>
-        <w:t>Weighted by modelled duration, automation coverage is A = 0.94 (Table 9). The reported manual procedure places four to six workers in the hazard zone for four to six hours, 16–36 person-hours per operation; with the automated system the routine value is zero, rising to at most 0.46 person-hours if gasket cassette loading has to be done at the flange rather than from outside the zone. The exposure reduction is the least uncertain benefit of the architecture: it does not depend on the step times that dominate the cycle-time uncertainty.</w:t>
+        <w:t>Weighted by modelled duration, automation coverage is A = 0.94 (Table 9). The reported manual procedure places four to six workers in the hazard zone for four to six hours, 16–36 person-hours per operation; with the automated system the routine value is zero, rising to at most 0.46 person-hours if gasket cassette loading has to be done at the flange rather than from outside the zone. The exposure reduction is the benefit least sensitive to the cycle-time modelling assumptions: it does not depend on the step times that dominate the cycle-time uncertainty, although it remains to be demonstrated in an integrated pilot.</w:t>
       </w:r>
     </w:p>
     <w:p>
@@ -8705,7 +8705,7 @@
           <w:i w:val="0"/>
           <w:sz w:val="22"/>
         </w:rPr>
-        <w:t>The analysis supports two of the three original targets and conditions the third. The exposure target is met by design. The torque-accuracy target is achievable but, on its own, does not deliver the preload quality it appears to promise; what delivers it is the angle channel. The cycle-time target is not met by the architecture as first described, with one runner per flange, anywhere within the investigated parameter bounds. The 8.0 h single-head result is not a failure of the concept but a finding about it: a single tool is the wrong architecture for a 92-bolt, multi-pass closure. The architecture the analysis supports has four synchronised heads per flange and one bolt-transfer channel per head, with the legacy tightening procedure unchanged, which brings bolting from 8.0 h to 1.8 h; a qualified two-star-pass procedure is an optional further step, not a requirement. Parallelisation, not faster tools, is what matters: the admissibility analysis shows that no plausible per-bolt time lets one head meet the target, and once torque application is parallelised every stage around it — bolt handling above all — must be parallelised too. This is a substantially larger and more expensive machine than the original proposal implied, and it changes the comparison with manual work: a single automated head is slower than a crew of four to six, and the automated system matches or improves on manual duration only when it too works several bolts at once. The target also has to be read as the source stated it, for bolting: the complete operation remains about 3.4 h, governed by head handling and the leak test, and shortening it is a separate design problem for those subsystems.</w:t>
+        <w:t>The analysis supports two of the three original targets and conditions the third. The architecture is designed to meet the exposure target, although achievement remains to be demonstrated in the integrated pilot. The torque-accuracy target is achievable but, on its own, does not deliver the preload quality it appears to promise; what delivers it is the angle channel. The cycle-time target is not met by the architecture as first described, with one runner per flange, anywhere within the investigated parameter bounds. The 8.0 h single-head result is not a failure of the concept but a finding about it: a single tool is the wrong architecture for a 92-bolt, multi-pass closure. The architecture the analysis supports has four synchronised heads per flange and one bolt-transfer channel per head, with the legacy tightening procedure unchanged, which brings bolting from 8.0 h to 1.8 h; a qualified two-star-pass procedure is an optional further step, not a requirement. Parallelisation, not faster tools, is what matters: the admissibility analysis shows that no plausible per-bolt time lets one head meet the target, and once torque application is parallelised every stage around it — bolt handling above all — must be parallelised too. This is a substantially larger and more expensive machine than the original proposal implied, and it changes the comparison with manual work: a single automated head is slower than a crew of four to six, and the automated system matches or improves on manual duration only when it too works several bolts at once. The target also has to be read as the source stated it, for bolting: the complete operation remains about 3.4 h, governed by head handling and the leak test, and shortening it is a separate design problem for those subsystems.</w:t>
       </w:r>
     </w:p>
     <w:p>
@@ -9518,7 +9518,7 @@
           <w:i w:val="0"/>
           <w:sz w:val="22"/>
         </w:rPr>
-        <w:t>with r = 4 heads and c = 4 transfer channels in the recommended configuration; the coefficients — rail and structure, each torque head, each transfer channel, the controls and the hazardous-area certification of the integrated assembly — require vendor quotations and are not estimated here. A staged programme — single-station rig, full-flange mock-up, then a pilot on one bottom head — allows the project to stop cheaply if the measured step times, nut-factor scatter or engagement success fall outside the ranges on which the results depend.</w:t>
+        <w:t>with r = 4 heads and c = 4 transfer channels in the preferred configuration; the coefficients — rail and structure, each torque head, each transfer channel, the controls and the hazardous-area certification of the integrated assembly — require vendor quotations and are not estimated here. A staged programme — single-station rig, full-flange mock-up, then a pilot on one bottom head — allows the project to stop cheaply if the measured step times, nut-factor scatter or engagement success fall outside the ranges on which the results depend.</w:t>
       </w:r>
     </w:p>
     <w:p>
@@ -9543,7 +9543,7 @@
           <w:i w:val="0"/>
           <w:sz w:val="22"/>
         </w:rPr>
-        <w:t>An automated architecture for opening and closing a 92-bolt, three-flange pressure vessel was evaluated by simulation against the targets originally claimed for it. With one torque head per flange, bolting takes a median 8.0 h and cannot meet a 2.5 h target within the investigated parameter bounds: a single tool is the wrong architecture for this closure. Parallelising in stages brings bolting to 2.3 h with four synchronised heads and 1.8 h with a bolt-transfer channel per head. That machine-only configuration, with the legacy tightening procedure unchanged, is the recommended design: it meets the bolting target in 98% of samples, and the ranking of architectures that leads to it holds in every sample under uniform, triangular and correlated input models. One fewer star pass would bring bolting to 1.6 h but is an optional process change that requires qualification of preload uniformity. An exactly optimised tool path and pipelined servicing add little, the first because the opposite-bolt rule fixes most of the travel and the second because the bottom head is on the critical path in every phase. The complete operation remains about 3.4 h, governed by head handling and the leak test, so the 2.5 h target holds for bolting but not for the whole operation; Eq. (14) gives the servicing-time envelope a faster design would have to meet. Specifying ±2% torque accuracy does little for preload, which nut-factor scatter dominates, whereas torque–angle verification with re-torque substantially narrows it, to an extent that depends on how well joint stiffness is known. Explicit-state verification found no violation of the seven safety invariants but exposed widespread deadlock in the initial interlock specification after interrupted sequences; adding an explicit resume rule eliminated every deadlock while preserving all seven invariants. Pneumatic head handling requires a counterbalance carrying most of the load. The reduction in hazard-zone exposure, from 16–36 person-hours to essentially none, is the most robust benefit. These are predictions, and the validation plan specifies the measurements that would confirm or overturn them.</w:t>
+        <w:t>An automated architecture for opening and closing a 92-bolt, three-flange pressure vessel was evaluated by simulation against the targets originally claimed for it. With one torque head per flange, bolting takes a median 8.0 h and cannot meet a 2.5 h target within the investigated parameter bounds: a single tool is the wrong architecture for this closure. Parallelising in stages brings bolting to 2.3 h with four synchronised heads and 1.8 h with a bolt-transfer channel per head. That machine-only configuration, with the legacy tightening procedure unchanged, is the configuration the present analysis supports and recommends for experimental development: it meets the bolting target in 98% of samples, and the ranking of architectures that leads to it held across all 20,000 simulated samples under uniform, triangular and correlated input models. One fewer star pass would bring bolting to 1.6 h but is an optional process change that requires qualification of preload uniformity. An exactly optimised tool path and pipelined servicing add little, the first because the opposite-bolt rule fixes most of the travel and the second because the bottom head is on the critical path in every phase. The complete operation remains about 3.4 h, governed by head handling and the leak test, so the 2.5 h target holds for bolting but not for the whole operation; Eq. (14) gives the servicing-time envelope a faster design would have to meet. Specifying ±2% torque accuracy does little for preload, which nut-factor scatter dominates, whereas torque–angle verification with re-torque substantially narrows it, to an extent that depends on how well joint stiffness is known. Explicit-state verification found no violation of the seven safety invariants but exposed widespread deadlock in the initial interlock specification after interrupted sequences; adding an explicit resume rule eliminated every deadlock while preserving all seven invariants. Pneumatic head handling requires a counterbalance carrying most of the load. The reduction in hazard-zone exposure, from 16–36 person-hours to essentially none by design, is the benefit least sensitive to the cycle-time modelling assumptions, though it too awaits demonstration. These are predictions, and the validation plan specifies the measurements that would confirm or overturn them.</w:t>
       </w:r>
     </w:p>
     <w:p>
@@ -9653,7 +9653,7 @@
         <w:t xml:space="preserve">Code availability. </w:t>
       </w:r>
       <w:r>
-        <w:t>The models, the verification script and the figure generators are openly available at https://github.com/sandlerleon/pabhs-bolting-model. Running pabhs_model.py, plc_verify.py and make_figures.py reproduces every number and figure.</w:t>
+        <w:t>The models, the verification script and the figure generators are openly available at https://github.com/sandlerleon/pabhs-bolting-model and archived at https://doi.org/10.5281/zenodo.22969548. Running pabhs_model.py, plc_verify.py and make_figures.py reproduces every number and figure.</w:t>
       </w:r>
     </w:p>
     <w:p>

</xml_diff>